<commit_message>
Plan de pruebas con criterios de aceptacion y pruebas de interfaz
</commit_message>
<xml_diff>
--- a/Docs/Test Plans/US532227-FiltrarEstacionesPorDistancia-TestPlan.docx
+++ b/Docs/Test Plans/US532227-FiltrarEstacionesPorDistancia-TestPlan.docx
@@ -32,13 +32,7 @@
         <w:rPr>
           <w:lang w:val="es-ES_tradnl"/>
         </w:rPr>
-        <w:t>Filtrar estaciones por distancia</w:t>
-      </w:r>
-      <w:r>
-        <w:rPr>
-          <w:lang w:val="es-ES_tradnl"/>
-        </w:rPr>
-        <w:t xml:space="preserve"> </w:t>
+        <w:t xml:space="preserve">Filtrar estaciones por distancia </w:t>
       </w:r>
       <w:r>
         <w:rPr>
@@ -134,7 +128,7 @@
         <w:spacing w:after="0" w:line="240" w:lineRule="auto"/>
       </w:pPr>
       <w:r>
-        <w:t>La aplicación detecta que la geolocalización está disponible</w:t>
+        <w:t>La aplicación solicita al técnico la distancia por la que desea filtrar (en Km).</w:t>
       </w:r>
     </w:p>
     <w:p>
@@ -150,7 +144,7 @@
         <w:spacing w:after="0" w:line="240" w:lineRule="auto"/>
       </w:pPr>
       <w:r>
-        <w:t>La aplicación solicita al técnico la distancia por la que desea filtrar (en Km).</w:t>
+        <w:t>El técnico introduce en la aplicación la distancia solicitada.</w:t>
       </w:r>
     </w:p>
     <w:p>
@@ -166,7 +160,7 @@
         <w:spacing w:after="0" w:line="240" w:lineRule="auto"/>
       </w:pPr>
       <w:r>
-        <w:t>El técnico introduce en la aplicación la distancia solicitada.</w:t>
+        <w:t>La aplicación comprueba que la distancia introducida es válida.</w:t>
       </w:r>
     </w:p>
     <w:p>
@@ -182,7 +176,7 @@
         <w:spacing w:after="0" w:line="240" w:lineRule="auto"/>
       </w:pPr>
       <w:r>
-        <w:t>La aplicación comprueba que la distancia introducida es válida.</w:t>
+        <w:t>La aplicación solicita al técnico si desea ver las estaciones a una distancia inferior o superior al límite establecido.</w:t>
       </w:r>
     </w:p>
     <w:p>
@@ -198,7 +192,7 @@
         <w:spacing w:after="0" w:line="240" w:lineRule="auto"/>
       </w:pPr>
       <w:r>
-        <w:t>La aplicación solicita al técnico si desea ver las estaciones a una distancia inferior o superior al límite establecido.</w:t>
+        <w:t>El técnico selecciona en la aplicación la opción que desee.</w:t>
       </w:r>
     </w:p>
     <w:p>
@@ -214,7 +208,7 @@
         <w:spacing w:after="0" w:line="240" w:lineRule="auto"/>
       </w:pPr>
       <w:r>
-        <w:t>El técnico selecciona en la aplicación la opción que desee.</w:t>
+        <w:t>La aplicación detecta que la geolocalización está disponible</w:t>
       </w:r>
     </w:p>
     <w:p>
@@ -314,7 +308,7 @@
         <w:spacing w:after="0" w:line="240" w:lineRule="auto"/>
       </w:pPr>
       <w:r>
-        <w:t>La aplicación detecta que la geolocalización está disponible</w:t>
+        <w:t>La aplicación solicita al técnico la distancia por la que desea filtrar (en Km).</w:t>
       </w:r>
     </w:p>
     <w:p>
@@ -330,7 +324,7 @@
         <w:spacing w:after="0" w:line="240" w:lineRule="auto"/>
       </w:pPr>
       <w:r>
-        <w:t>La aplicación solicita al técnico la distancia por la que desea filtrar (en Km).</w:t>
+        <w:t>El técnico introduce en la aplicación la distancia solicitada.</w:t>
       </w:r>
     </w:p>
     <w:p>
@@ -346,7 +340,7 @@
         <w:spacing w:after="0" w:line="240" w:lineRule="auto"/>
       </w:pPr>
       <w:r>
-        <w:t>El técnico introduce en la aplicación la distancia solicitada.</w:t>
+        <w:t>La aplicación comprueba que la distancia introducida es válida.</w:t>
       </w:r>
     </w:p>
     <w:p>
@@ -362,7 +356,7 @@
         <w:spacing w:after="0" w:line="240" w:lineRule="auto"/>
       </w:pPr>
       <w:r>
-        <w:t>La aplicación comprueba que la distancia introducida es válida.</w:t>
+        <w:t>La aplicación solicita al técnico si desea ver las estaciones a una distancia inferior o superior al límite establecido.</w:t>
       </w:r>
     </w:p>
     <w:p>
@@ -378,7 +372,7 @@
         <w:spacing w:after="0" w:line="240" w:lineRule="auto"/>
       </w:pPr>
       <w:r>
-        <w:t>La aplicación solicita al técnico si desea ver las estaciones a una distancia inferior o superior al límite establecido.</w:t>
+        <w:t>El técnico selecciona en la aplicación la opción que desee.</w:t>
       </w:r>
     </w:p>
     <w:p>
@@ -394,7 +388,7 @@
         <w:spacing w:after="0" w:line="240" w:lineRule="auto"/>
       </w:pPr>
       <w:r>
-        <w:t>El técnico selecciona en la aplicación la opción que desee.</w:t>
+        <w:t>La aplicación detecta que la geolocalización está disponible</w:t>
       </w:r>
     </w:p>
     <w:p>
@@ -537,7 +531,13 @@
         <w:spacing w:after="0" w:line="240" w:lineRule="auto"/>
       </w:pPr>
       <w:r>
-        <w:t>Se verifica que la aplicación impide al técnico introducir la distancia.</w:t>
+        <w:t>Se verifica que la aplicación impide al técnico introducir la distancia</w:t>
+      </w:r>
+      <w:r>
+        <w:t xml:space="preserve"> y se le notifica</w:t>
+      </w:r>
+      <w:r>
+        <w:t>.</w:t>
       </w:r>
     </w:p>
     <w:p>
@@ -570,7 +570,7 @@
         <w:pStyle w:val="Prrafodelista"/>
         <w:numPr>
           <w:ilvl w:val="0"/>
-          <w:numId w:val="13"/>
+          <w:numId w:val="34"/>
         </w:numPr>
         <w:autoSpaceDE w:val="0"/>
         <w:autoSpaceDN w:val="0"/>
@@ -578,7 +578,7 @@
         <w:spacing w:after="0" w:line="240" w:lineRule="auto"/>
       </w:pPr>
       <w:r>
-        <w:t>La aplicación detecta que la geolocalización no está disponible.</w:t>
+        <w:t>La aplicación solicita al técnico la distancia por la que desea filtrar (en Km).</w:t>
       </w:r>
     </w:p>
     <w:p>
@@ -586,7 +586,7 @@
         <w:pStyle w:val="Prrafodelista"/>
         <w:numPr>
           <w:ilvl w:val="0"/>
-          <w:numId w:val="13"/>
+          <w:numId w:val="34"/>
         </w:numPr>
         <w:autoSpaceDE w:val="0"/>
         <w:autoSpaceDN w:val="0"/>
@@ -594,6 +594,87 @@
         <w:spacing w:after="0" w:line="240" w:lineRule="auto"/>
       </w:pPr>
       <w:r>
+        <w:t>El técnico introduce en la aplicación la distancia solicitada.</w:t>
+      </w:r>
+    </w:p>
+    <w:p>
+      <w:pPr>
+        <w:pStyle w:val="Prrafodelista"/>
+        <w:numPr>
+          <w:ilvl w:val="0"/>
+          <w:numId w:val="34"/>
+        </w:numPr>
+        <w:autoSpaceDE w:val="0"/>
+        <w:autoSpaceDN w:val="0"/>
+        <w:adjustRightInd w:val="0"/>
+        <w:spacing w:after="0" w:line="240" w:lineRule="auto"/>
+      </w:pPr>
+      <w:r>
+        <w:t>La aplicación comprueba que la distancia introducida es válida.</w:t>
+      </w:r>
+    </w:p>
+    <w:p>
+      <w:pPr>
+        <w:pStyle w:val="Prrafodelista"/>
+        <w:numPr>
+          <w:ilvl w:val="0"/>
+          <w:numId w:val="34"/>
+        </w:numPr>
+        <w:autoSpaceDE w:val="0"/>
+        <w:autoSpaceDN w:val="0"/>
+        <w:adjustRightInd w:val="0"/>
+        <w:spacing w:after="0" w:line="240" w:lineRule="auto"/>
+      </w:pPr>
+      <w:r>
+        <w:t>La aplicación solicita al técnico si desea ver las estaciones a una distancia inferior o superior al límite establecido.</w:t>
+      </w:r>
+    </w:p>
+    <w:p>
+      <w:pPr>
+        <w:pStyle w:val="Prrafodelista"/>
+        <w:numPr>
+          <w:ilvl w:val="0"/>
+          <w:numId w:val="34"/>
+        </w:numPr>
+        <w:autoSpaceDE w:val="0"/>
+        <w:autoSpaceDN w:val="0"/>
+        <w:adjustRightInd w:val="0"/>
+        <w:spacing w:after="0" w:line="240" w:lineRule="auto"/>
+      </w:pPr>
+      <w:r>
+        <w:t>El técnico selecciona en la aplicación la opción que desee.</w:t>
+      </w:r>
+    </w:p>
+    <w:p>
+      <w:pPr>
+        <w:pStyle w:val="Prrafodelista"/>
+        <w:numPr>
+          <w:ilvl w:val="0"/>
+          <w:numId w:val="34"/>
+        </w:numPr>
+        <w:autoSpaceDE w:val="0"/>
+        <w:autoSpaceDN w:val="0"/>
+        <w:adjustRightInd w:val="0"/>
+        <w:spacing w:after="0" w:line="240" w:lineRule="auto"/>
+      </w:pPr>
+      <w:r>
+        <w:t>La aplicación detecta que la geolocalización no está disponible.</w:t>
+      </w:r>
+    </w:p>
+    <w:p>
+      <w:pPr>
+        <w:pStyle w:val="Prrafodelista"/>
+        <w:numPr>
+          <w:ilvl w:val="0"/>
+          <w:numId w:val="34"/>
+        </w:numPr>
+        <w:autoSpaceDE w:val="0"/>
+        <w:autoSpaceDN w:val="0"/>
+        <w:adjustRightInd w:val="0"/>
+        <w:spacing w:after="0" w:line="240" w:lineRule="auto"/>
+      </w:pPr>
+      <w:r>
+        <w:lastRenderedPageBreak/>
         <w:t xml:space="preserve">Se verifica que la aplicación notifica al técnico que la geolocalización </w:t>
       </w:r>
       <w:r>
@@ -659,7 +740,7 @@
         <w:spacing w:after="0" w:line="240" w:lineRule="auto"/>
       </w:pPr>
       <w:r>
-        <w:t>La aplicación detecta que la geolocalización está disponible</w:t>
+        <w:t>La aplicación solicita al técnico la distancia por la que desea filtrar (en Km).</w:t>
       </w:r>
     </w:p>
     <w:p>
@@ -675,8 +756,13 @@
         <w:spacing w:after="0" w:line="240" w:lineRule="auto"/>
       </w:pPr>
       <w:r>
-        <w:lastRenderedPageBreak/>
-        <w:t>La aplicación solicita al técnico la distancia por la que desea filtrar (en Km).</w:t>
+        <w:t xml:space="preserve">El técnico introduce </w:t>
+      </w:r>
+      <w:r>
+        <w:t xml:space="preserve">5Km </w:t>
+      </w:r>
+      <w:r>
+        <w:t>en la aplicación.</w:t>
       </w:r>
     </w:p>
     <w:p>
@@ -692,13 +778,7 @@
         <w:spacing w:after="0" w:line="240" w:lineRule="auto"/>
       </w:pPr>
       <w:r>
-        <w:t xml:space="preserve">El técnico introduce </w:t>
-      </w:r>
-      <w:r>
-        <w:t xml:space="preserve">5Km </w:t>
-      </w:r>
-      <w:r>
-        <w:t>en la aplicación.</w:t>
+        <w:t>La aplicación comprueba que la distancia introducida es válida.</w:t>
       </w:r>
     </w:p>
     <w:p>
@@ -714,7 +794,7 @@
         <w:spacing w:after="0" w:line="240" w:lineRule="auto"/>
       </w:pPr>
       <w:r>
-        <w:t>La aplicación comprueba que la distancia introducida es válida.</w:t>
+        <w:t>La aplicación solicita al técnico si desea ver las estaciones a una distancia inferior o superior al límite establecido.</w:t>
       </w:r>
     </w:p>
     <w:p>
@@ -730,7 +810,19 @@
         <w:spacing w:after="0" w:line="240" w:lineRule="auto"/>
       </w:pPr>
       <w:r>
-        <w:t>La aplicación solicita al técnico si desea ver las estaciones a una distancia inferior o superior al límite establecido.</w:t>
+        <w:t xml:space="preserve">El técnico selecciona en la aplicación la opción </w:t>
+      </w:r>
+      <w:r>
+        <w:t>de ver</w:t>
+      </w:r>
+      <w:r>
+        <w:t xml:space="preserve"> a una distancia </w:t>
+      </w:r>
+      <w:r>
+        <w:t>superior</w:t>
+      </w:r>
+      <w:r>
+        <w:t>.</w:t>
       </w:r>
     </w:p>
     <w:p>
@@ -746,19 +838,7 @@
         <w:spacing w:after="0" w:line="240" w:lineRule="auto"/>
       </w:pPr>
       <w:r>
-        <w:t xml:space="preserve">El técnico selecciona en la aplicación la opción </w:t>
-      </w:r>
-      <w:r>
-        <w:t>de ver</w:t>
-      </w:r>
-      <w:r>
-        <w:t xml:space="preserve"> a una distancia </w:t>
-      </w:r>
-      <w:r>
-        <w:t>superior</w:t>
-      </w:r>
-      <w:r>
-        <w:t>.</w:t>
+        <w:t>La aplicación detecta que la geolocalización está disponible</w:t>
       </w:r>
     </w:p>
     <w:p>
@@ -966,7 +1046,7 @@
         <w:spacing w:after="0" w:line="240" w:lineRule="auto"/>
       </w:pPr>
       <w:r>
-        <w:t>La aplicación detecta que no hay estaciones en el rango de filtrado.</w:t>
+        <w:t>La aplicación detecta que la geolocalización está disponible</w:t>
       </w:r>
     </w:p>
     <w:p>
@@ -982,6 +1062,22 @@
         <w:spacing w:after="0" w:line="240" w:lineRule="auto"/>
       </w:pPr>
       <w:r>
+        <w:t>La aplicación detecta que no hay estaciones en el rango de filtrado.</w:t>
+      </w:r>
+    </w:p>
+    <w:p>
+      <w:pPr>
+        <w:pStyle w:val="Prrafodelista"/>
+        <w:numPr>
+          <w:ilvl w:val="0"/>
+          <w:numId w:val="24"/>
+        </w:numPr>
+        <w:autoSpaceDE w:val="0"/>
+        <w:autoSpaceDN w:val="0"/>
+        <w:adjustRightInd w:val="0"/>
+        <w:spacing w:after="0" w:line="240" w:lineRule="auto"/>
+      </w:pPr>
+      <w:r>
         <w:t xml:space="preserve">Se verifica que la aplicación notifica al técnico </w:t>
       </w:r>
       <w:r>
@@ -1158,7 +1254,7 @@
         <w:pStyle w:val="Prrafodelista"/>
         <w:numPr>
           <w:ilvl w:val="0"/>
-          <w:numId w:val="26"/>
+          <w:numId w:val="38"/>
         </w:numPr>
         <w:autoSpaceDE w:val="0"/>
         <w:autoSpaceDN w:val="0"/>
@@ -1166,13 +1262,7 @@
         <w:spacing w:after="0" w:line="240" w:lineRule="auto"/>
       </w:pPr>
       <w:r>
-        <w:t xml:space="preserve">La aplicación detecta que la geolocalización </w:t>
-      </w:r>
-      <w:r>
-        <w:t xml:space="preserve">no </w:t>
-      </w:r>
-      <w:r>
-        <w:t>está disponible</w:t>
+        <w:t>La aplicación solicita al técnico la distancia por la que desea filtrar (en Km).</w:t>
       </w:r>
     </w:p>
     <w:p>
@@ -1180,7 +1270,7 @@
         <w:pStyle w:val="Prrafodelista"/>
         <w:numPr>
           <w:ilvl w:val="0"/>
-          <w:numId w:val="26"/>
+          <w:numId w:val="38"/>
         </w:numPr>
         <w:autoSpaceDE w:val="0"/>
         <w:autoSpaceDN w:val="0"/>
@@ -1188,6 +1278,93 @@
         <w:spacing w:after="0" w:line="240" w:lineRule="auto"/>
       </w:pPr>
       <w:r>
+        <w:t>El técnico introduce 5Km en la aplicación.</w:t>
+      </w:r>
+    </w:p>
+    <w:p>
+      <w:pPr>
+        <w:pStyle w:val="Prrafodelista"/>
+        <w:numPr>
+          <w:ilvl w:val="0"/>
+          <w:numId w:val="38"/>
+        </w:numPr>
+        <w:autoSpaceDE w:val="0"/>
+        <w:autoSpaceDN w:val="0"/>
+        <w:adjustRightInd w:val="0"/>
+        <w:spacing w:after="0" w:line="240" w:lineRule="auto"/>
+      </w:pPr>
+      <w:r>
+        <w:t>La aplicación comprueba que la distancia introducida es válida.</w:t>
+      </w:r>
+    </w:p>
+    <w:p>
+      <w:pPr>
+        <w:pStyle w:val="Prrafodelista"/>
+        <w:numPr>
+          <w:ilvl w:val="0"/>
+          <w:numId w:val="38"/>
+        </w:numPr>
+        <w:autoSpaceDE w:val="0"/>
+        <w:autoSpaceDN w:val="0"/>
+        <w:adjustRightInd w:val="0"/>
+        <w:spacing w:after="0" w:line="240" w:lineRule="auto"/>
+      </w:pPr>
+      <w:r>
+        <w:t>La aplicación solicita al técnico si desea ver las estaciones a una distancia inferior o superior al límite establecido.</w:t>
+      </w:r>
+    </w:p>
+    <w:p>
+      <w:pPr>
+        <w:pStyle w:val="Prrafodelista"/>
+        <w:numPr>
+          <w:ilvl w:val="0"/>
+          <w:numId w:val="38"/>
+        </w:numPr>
+        <w:autoSpaceDE w:val="0"/>
+        <w:autoSpaceDN w:val="0"/>
+        <w:adjustRightInd w:val="0"/>
+        <w:spacing w:after="0" w:line="240" w:lineRule="auto"/>
+      </w:pPr>
+      <w:r>
+        <w:t>El técnico selecciona en la aplicación la opción de ver a una distancia superior.</w:t>
+      </w:r>
+    </w:p>
+    <w:p>
+      <w:pPr>
+        <w:pStyle w:val="Prrafodelista"/>
+        <w:numPr>
+          <w:ilvl w:val="0"/>
+          <w:numId w:val="38"/>
+        </w:numPr>
+        <w:autoSpaceDE w:val="0"/>
+        <w:autoSpaceDN w:val="0"/>
+        <w:adjustRightInd w:val="0"/>
+        <w:spacing w:after="0" w:line="240" w:lineRule="auto"/>
+      </w:pPr>
+      <w:r>
+        <w:t xml:space="preserve">La aplicación detecta que la geolocalización </w:t>
+      </w:r>
+      <w:r>
+        <w:t xml:space="preserve">no </w:t>
+      </w:r>
+      <w:r>
+        <w:t>está disponible</w:t>
+      </w:r>
+    </w:p>
+    <w:p>
+      <w:pPr>
+        <w:pStyle w:val="Prrafodelista"/>
+        <w:numPr>
+          <w:ilvl w:val="0"/>
+          <w:numId w:val="38"/>
+        </w:numPr>
+        <w:autoSpaceDE w:val="0"/>
+        <w:autoSpaceDN w:val="0"/>
+        <w:adjustRightInd w:val="0"/>
+        <w:spacing w:after="0" w:line="240" w:lineRule="auto"/>
+      </w:pPr>
+      <w:r>
+        <w:lastRenderedPageBreak/>
         <w:t>Se verifica que la aplicación notifica al técnico</w:t>
       </w:r>
       <w:r>
@@ -1475,7 +1652,6 @@
           </w:p>
           <w:p>
             <w:r>
-              <w:lastRenderedPageBreak/>
               <w:t>(</w:t>
             </w:r>
             <w:r>
@@ -1492,7 +1668,6 @@
           </w:tcPr>
           <w:p>
             <w:r>
-              <w:lastRenderedPageBreak/>
               <w:t>(Nombre)</w:t>
             </w:r>
             <w:proofErr w:type="spellStart"/>
@@ -1509,7 +1684,6 @@
           </w:p>
           <w:p>
             <w:r>
-              <w:lastRenderedPageBreak/>
               <w:t>(Ciudad)Barcelona</w:t>
             </w:r>
             <w:r>
@@ -1613,7 +1787,6 @@
               <w:jc w:val="both"/>
             </w:pPr>
             <w:r>
-              <w:lastRenderedPageBreak/>
               <w:t>PU-02</w:t>
             </w:r>
           </w:p>
@@ -2424,6 +2597,92 @@
     </w:lvl>
   </w:abstractNum>
   <w:abstractNum w:abstractNumId="1" w15:restartNumberingAfterBreak="0">
+    <w:nsid w:val="0493181F"/>
+    <w:multiLevelType w:val="hybridMultilevel"/>
+    <w:tmpl w:val="2B7CB03E"/>
+    <w:lvl w:ilvl="0" w:tplc="FFFFFFFF">
+      <w:start w:val="1"/>
+      <w:numFmt w:val="decimal"/>
+      <w:lvlText w:val="%1."/>
+      <w:lvlJc w:val="left"/>
+      <w:pPr>
+        <w:ind w:left="720" w:hanging="360"/>
+      </w:pPr>
+    </w:lvl>
+    <w:lvl w:ilvl="1" w:tplc="0C0A0019">
+      <w:start w:val="1"/>
+      <w:numFmt w:val="lowerLetter"/>
+      <w:lvlText w:val="%2."/>
+      <w:lvlJc w:val="left"/>
+      <w:pPr>
+        <w:ind w:left="1440" w:hanging="360"/>
+      </w:pPr>
+    </w:lvl>
+    <w:lvl w:ilvl="2" w:tplc="0C0A001B" w:tentative="1">
+      <w:start w:val="1"/>
+      <w:numFmt w:val="lowerRoman"/>
+      <w:lvlText w:val="%3."/>
+      <w:lvlJc w:val="right"/>
+      <w:pPr>
+        <w:ind w:left="2160" w:hanging="180"/>
+      </w:pPr>
+    </w:lvl>
+    <w:lvl w:ilvl="3" w:tplc="0C0A000F" w:tentative="1">
+      <w:start w:val="1"/>
+      <w:numFmt w:val="decimal"/>
+      <w:lvlText w:val="%4."/>
+      <w:lvlJc w:val="left"/>
+      <w:pPr>
+        <w:ind w:left="2880" w:hanging="360"/>
+      </w:pPr>
+    </w:lvl>
+    <w:lvl w:ilvl="4" w:tplc="0C0A0019" w:tentative="1">
+      <w:start w:val="1"/>
+      <w:numFmt w:val="lowerLetter"/>
+      <w:lvlText w:val="%5."/>
+      <w:lvlJc w:val="left"/>
+      <w:pPr>
+        <w:ind w:left="3600" w:hanging="360"/>
+      </w:pPr>
+    </w:lvl>
+    <w:lvl w:ilvl="5" w:tplc="0C0A001B" w:tentative="1">
+      <w:start w:val="1"/>
+      <w:numFmt w:val="lowerRoman"/>
+      <w:lvlText w:val="%6."/>
+      <w:lvlJc w:val="right"/>
+      <w:pPr>
+        <w:ind w:left="4320" w:hanging="180"/>
+      </w:pPr>
+    </w:lvl>
+    <w:lvl w:ilvl="6" w:tplc="0C0A000F" w:tentative="1">
+      <w:start w:val="1"/>
+      <w:numFmt w:val="decimal"/>
+      <w:lvlText w:val="%7."/>
+      <w:lvlJc w:val="left"/>
+      <w:pPr>
+        <w:ind w:left="5040" w:hanging="360"/>
+      </w:pPr>
+    </w:lvl>
+    <w:lvl w:ilvl="7" w:tplc="0C0A0019" w:tentative="1">
+      <w:start w:val="1"/>
+      <w:numFmt w:val="lowerLetter"/>
+      <w:lvlText w:val="%8."/>
+      <w:lvlJc w:val="left"/>
+      <w:pPr>
+        <w:ind w:left="5760" w:hanging="360"/>
+      </w:pPr>
+    </w:lvl>
+    <w:lvl w:ilvl="8" w:tplc="0C0A001B" w:tentative="1">
+      <w:start w:val="1"/>
+      <w:numFmt w:val="lowerRoman"/>
+      <w:lvlText w:val="%9."/>
+      <w:lvlJc w:val="right"/>
+      <w:pPr>
+        <w:ind w:left="6480" w:hanging="180"/>
+      </w:pPr>
+    </w:lvl>
+  </w:abstractNum>
+  <w:abstractNum w:abstractNumId="2" w15:restartNumberingAfterBreak="0">
     <w:nsid w:val="08D922BA"/>
     <w:multiLevelType w:val="hybridMultilevel"/>
     <w:tmpl w:val="94701198"/>
@@ -2512,7 +2771,7 @@
       </w:pPr>
     </w:lvl>
   </w:abstractNum>
-  <w:abstractNum w:abstractNumId="2" w15:restartNumberingAfterBreak="0">
+  <w:abstractNum w:abstractNumId="3" w15:restartNumberingAfterBreak="0">
     <w:nsid w:val="0A89570E"/>
     <w:multiLevelType w:val="hybridMultilevel"/>
     <w:tmpl w:val="FC8AFA04"/>
@@ -2598,7 +2857,7 @@
       </w:pPr>
     </w:lvl>
   </w:abstractNum>
-  <w:abstractNum w:abstractNumId="3" w15:restartNumberingAfterBreak="0">
+  <w:abstractNum w:abstractNumId="4" w15:restartNumberingAfterBreak="0">
     <w:nsid w:val="0B0334E0"/>
     <w:multiLevelType w:val="hybridMultilevel"/>
     <w:tmpl w:val="3E98CABE"/>
@@ -2687,7 +2946,7 @@
       </w:pPr>
     </w:lvl>
   </w:abstractNum>
-  <w:abstractNum w:abstractNumId="4" w15:restartNumberingAfterBreak="0">
+  <w:abstractNum w:abstractNumId="5" w15:restartNumberingAfterBreak="0">
     <w:nsid w:val="0C6C3B9C"/>
     <w:multiLevelType w:val="hybridMultilevel"/>
     <w:tmpl w:val="2EDAB574"/>
@@ -2773,7 +3032,7 @@
       </w:pPr>
     </w:lvl>
   </w:abstractNum>
-  <w:abstractNum w:abstractNumId="5" w15:restartNumberingAfterBreak="0">
+  <w:abstractNum w:abstractNumId="6" w15:restartNumberingAfterBreak="0">
     <w:nsid w:val="0D1D566F"/>
     <w:multiLevelType w:val="hybridMultilevel"/>
     <w:tmpl w:val="500EC3C0"/>
@@ -2859,7 +3118,7 @@
       </w:pPr>
     </w:lvl>
   </w:abstractNum>
-  <w:abstractNum w:abstractNumId="6" w15:restartNumberingAfterBreak="0">
+  <w:abstractNum w:abstractNumId="7" w15:restartNumberingAfterBreak="0">
     <w:nsid w:val="0D854AEC"/>
     <w:multiLevelType w:val="hybridMultilevel"/>
     <w:tmpl w:val="15F268E2"/>
@@ -2945,7 +3204,7 @@
       </w:pPr>
     </w:lvl>
   </w:abstractNum>
-  <w:abstractNum w:abstractNumId="7" w15:restartNumberingAfterBreak="0">
+  <w:abstractNum w:abstractNumId="8" w15:restartNumberingAfterBreak="0">
     <w:nsid w:val="102A4784"/>
     <w:multiLevelType w:val="hybridMultilevel"/>
     <w:tmpl w:val="74544868"/>
@@ -3031,7 +3290,7 @@
       </w:pPr>
     </w:lvl>
   </w:abstractNum>
-  <w:abstractNum w:abstractNumId="8" w15:restartNumberingAfterBreak="0">
+  <w:abstractNum w:abstractNumId="9" w15:restartNumberingAfterBreak="0">
     <w:nsid w:val="13304A80"/>
     <w:multiLevelType w:val="hybridMultilevel"/>
     <w:tmpl w:val="954647AA"/>
@@ -3117,7 +3376,7 @@
       </w:pPr>
     </w:lvl>
   </w:abstractNum>
-  <w:abstractNum w:abstractNumId="9" w15:restartNumberingAfterBreak="0">
+  <w:abstractNum w:abstractNumId="10" w15:restartNumberingAfterBreak="0">
     <w:nsid w:val="1D922618"/>
     <w:multiLevelType w:val="hybridMultilevel"/>
     <w:tmpl w:val="2AFA1872"/>
@@ -3203,7 +3462,7 @@
       </w:pPr>
     </w:lvl>
   </w:abstractNum>
-  <w:abstractNum w:abstractNumId="10" w15:restartNumberingAfterBreak="0">
+  <w:abstractNum w:abstractNumId="11" w15:restartNumberingAfterBreak="0">
     <w:nsid w:val="21951C4A"/>
     <w:multiLevelType w:val="hybridMultilevel"/>
     <w:tmpl w:val="101EAA26"/>
@@ -3289,7 +3548,7 @@
       </w:pPr>
     </w:lvl>
   </w:abstractNum>
-  <w:abstractNum w:abstractNumId="11" w15:restartNumberingAfterBreak="0">
+  <w:abstractNum w:abstractNumId="12" w15:restartNumberingAfterBreak="0">
     <w:nsid w:val="22A96F2C"/>
     <w:multiLevelType w:val="hybridMultilevel"/>
     <w:tmpl w:val="8EC80A2C"/>
@@ -3375,7 +3634,7 @@
       </w:pPr>
     </w:lvl>
   </w:abstractNum>
-  <w:abstractNum w:abstractNumId="12" w15:restartNumberingAfterBreak="0">
+  <w:abstractNum w:abstractNumId="13" w15:restartNumberingAfterBreak="0">
     <w:nsid w:val="2EE828CB"/>
     <w:multiLevelType w:val="hybridMultilevel"/>
     <w:tmpl w:val="59FEC90E"/>
@@ -3461,7 +3720,7 @@
       </w:pPr>
     </w:lvl>
   </w:abstractNum>
-  <w:abstractNum w:abstractNumId="13" w15:restartNumberingAfterBreak="0">
+  <w:abstractNum w:abstractNumId="14" w15:restartNumberingAfterBreak="0">
     <w:nsid w:val="35595B14"/>
     <w:multiLevelType w:val="hybridMultilevel"/>
     <w:tmpl w:val="904081A8"/>
@@ -3547,7 +3806,7 @@
       </w:pPr>
     </w:lvl>
   </w:abstractNum>
-  <w:abstractNum w:abstractNumId="14" w15:restartNumberingAfterBreak="0">
+  <w:abstractNum w:abstractNumId="15" w15:restartNumberingAfterBreak="0">
     <w:nsid w:val="3B142800"/>
     <w:multiLevelType w:val="hybridMultilevel"/>
     <w:tmpl w:val="6FBABDB0"/>
@@ -3633,7 +3892,93 @@
       </w:pPr>
     </w:lvl>
   </w:abstractNum>
-  <w:abstractNum w:abstractNumId="15" w15:restartNumberingAfterBreak="0">
+  <w:abstractNum w:abstractNumId="16" w15:restartNumberingAfterBreak="0">
+    <w:nsid w:val="3B2659C6"/>
+    <w:multiLevelType w:val="hybridMultilevel"/>
+    <w:tmpl w:val="6FC67506"/>
+    <w:lvl w:ilvl="0" w:tplc="FFFFFFFF">
+      <w:start w:val="1"/>
+      <w:numFmt w:val="decimal"/>
+      <w:lvlText w:val="%1."/>
+      <w:lvlJc w:val="left"/>
+      <w:pPr>
+        <w:ind w:left="1080" w:hanging="360"/>
+      </w:pPr>
+    </w:lvl>
+    <w:lvl w:ilvl="1" w:tplc="0C0A0019" w:tentative="1">
+      <w:start w:val="1"/>
+      <w:numFmt w:val="lowerLetter"/>
+      <w:lvlText w:val="%2."/>
+      <w:lvlJc w:val="left"/>
+      <w:pPr>
+        <w:ind w:left="1800" w:hanging="360"/>
+      </w:pPr>
+    </w:lvl>
+    <w:lvl w:ilvl="2" w:tplc="0C0A001B" w:tentative="1">
+      <w:start w:val="1"/>
+      <w:numFmt w:val="lowerRoman"/>
+      <w:lvlText w:val="%3."/>
+      <w:lvlJc w:val="right"/>
+      <w:pPr>
+        <w:ind w:left="2520" w:hanging="180"/>
+      </w:pPr>
+    </w:lvl>
+    <w:lvl w:ilvl="3" w:tplc="0C0A000F" w:tentative="1">
+      <w:start w:val="1"/>
+      <w:numFmt w:val="decimal"/>
+      <w:lvlText w:val="%4."/>
+      <w:lvlJc w:val="left"/>
+      <w:pPr>
+        <w:ind w:left="3240" w:hanging="360"/>
+      </w:pPr>
+    </w:lvl>
+    <w:lvl w:ilvl="4" w:tplc="0C0A0019" w:tentative="1">
+      <w:start w:val="1"/>
+      <w:numFmt w:val="lowerLetter"/>
+      <w:lvlText w:val="%5."/>
+      <w:lvlJc w:val="left"/>
+      <w:pPr>
+        <w:ind w:left="3960" w:hanging="360"/>
+      </w:pPr>
+    </w:lvl>
+    <w:lvl w:ilvl="5" w:tplc="0C0A001B" w:tentative="1">
+      <w:start w:val="1"/>
+      <w:numFmt w:val="lowerRoman"/>
+      <w:lvlText w:val="%6."/>
+      <w:lvlJc w:val="right"/>
+      <w:pPr>
+        <w:ind w:left="4680" w:hanging="180"/>
+      </w:pPr>
+    </w:lvl>
+    <w:lvl w:ilvl="6" w:tplc="0C0A000F" w:tentative="1">
+      <w:start w:val="1"/>
+      <w:numFmt w:val="decimal"/>
+      <w:lvlText w:val="%7."/>
+      <w:lvlJc w:val="left"/>
+      <w:pPr>
+        <w:ind w:left="5400" w:hanging="360"/>
+      </w:pPr>
+    </w:lvl>
+    <w:lvl w:ilvl="7" w:tplc="0C0A0019" w:tentative="1">
+      <w:start w:val="1"/>
+      <w:numFmt w:val="lowerLetter"/>
+      <w:lvlText w:val="%8."/>
+      <w:lvlJc w:val="left"/>
+      <w:pPr>
+        <w:ind w:left="6120" w:hanging="360"/>
+      </w:pPr>
+    </w:lvl>
+    <w:lvl w:ilvl="8" w:tplc="0C0A001B" w:tentative="1">
+      <w:start w:val="1"/>
+      <w:numFmt w:val="lowerRoman"/>
+      <w:lvlText w:val="%9."/>
+      <w:lvlJc w:val="right"/>
+      <w:pPr>
+        <w:ind w:left="6840" w:hanging="180"/>
+      </w:pPr>
+    </w:lvl>
+  </w:abstractNum>
+  <w:abstractNum w:abstractNumId="17" w15:restartNumberingAfterBreak="0">
     <w:nsid w:val="3B393657"/>
     <w:multiLevelType w:val="hybridMultilevel"/>
     <w:tmpl w:val="A996489E"/>
@@ -3719,7 +4064,7 @@
       </w:pPr>
     </w:lvl>
   </w:abstractNum>
-  <w:abstractNum w:abstractNumId="16" w15:restartNumberingAfterBreak="0">
+  <w:abstractNum w:abstractNumId="18" w15:restartNumberingAfterBreak="0">
     <w:nsid w:val="3D44168C"/>
     <w:multiLevelType w:val="hybridMultilevel"/>
     <w:tmpl w:val="E938914C"/>
@@ -3808,7 +4153,7 @@
       </w:pPr>
     </w:lvl>
   </w:abstractNum>
-  <w:abstractNum w:abstractNumId="17" w15:restartNumberingAfterBreak="0">
+  <w:abstractNum w:abstractNumId="19" w15:restartNumberingAfterBreak="0">
     <w:nsid w:val="3D7E3D1D"/>
     <w:multiLevelType w:val="hybridMultilevel"/>
     <w:tmpl w:val="6428CCA8"/>
@@ -3894,7 +4239,7 @@
       </w:pPr>
     </w:lvl>
   </w:abstractNum>
-  <w:abstractNum w:abstractNumId="18" w15:restartNumberingAfterBreak="0">
+  <w:abstractNum w:abstractNumId="20" w15:restartNumberingAfterBreak="0">
     <w:nsid w:val="3DDB2FE0"/>
     <w:multiLevelType w:val="hybridMultilevel"/>
     <w:tmpl w:val="A2309F8A"/>
@@ -3980,7 +4325,93 @@
       </w:pPr>
     </w:lvl>
   </w:abstractNum>
-  <w:abstractNum w:abstractNumId="19" w15:restartNumberingAfterBreak="0">
+  <w:abstractNum w:abstractNumId="21" w15:restartNumberingAfterBreak="0">
+    <w:nsid w:val="407F1A2B"/>
+    <w:multiLevelType w:val="hybridMultilevel"/>
+    <w:tmpl w:val="8EC80A2C"/>
+    <w:lvl w:ilvl="0" w:tplc="FFFFFFFF">
+      <w:start w:val="1"/>
+      <w:numFmt w:val="decimal"/>
+      <w:lvlText w:val="%1."/>
+      <w:lvlJc w:val="left"/>
+      <w:pPr>
+        <w:ind w:left="720" w:hanging="360"/>
+      </w:pPr>
+    </w:lvl>
+    <w:lvl w:ilvl="1" w:tplc="FFFFFFFF" w:tentative="1">
+      <w:start w:val="1"/>
+      <w:numFmt w:val="lowerLetter"/>
+      <w:lvlText w:val="%2."/>
+      <w:lvlJc w:val="left"/>
+      <w:pPr>
+        <w:ind w:left="1440" w:hanging="360"/>
+      </w:pPr>
+    </w:lvl>
+    <w:lvl w:ilvl="2" w:tplc="FFFFFFFF" w:tentative="1">
+      <w:start w:val="1"/>
+      <w:numFmt w:val="lowerRoman"/>
+      <w:lvlText w:val="%3."/>
+      <w:lvlJc w:val="right"/>
+      <w:pPr>
+        <w:ind w:left="2160" w:hanging="180"/>
+      </w:pPr>
+    </w:lvl>
+    <w:lvl w:ilvl="3" w:tplc="FFFFFFFF" w:tentative="1">
+      <w:start w:val="1"/>
+      <w:numFmt w:val="decimal"/>
+      <w:lvlText w:val="%4."/>
+      <w:lvlJc w:val="left"/>
+      <w:pPr>
+        <w:ind w:left="2880" w:hanging="360"/>
+      </w:pPr>
+    </w:lvl>
+    <w:lvl w:ilvl="4" w:tplc="FFFFFFFF" w:tentative="1">
+      <w:start w:val="1"/>
+      <w:numFmt w:val="lowerLetter"/>
+      <w:lvlText w:val="%5."/>
+      <w:lvlJc w:val="left"/>
+      <w:pPr>
+        <w:ind w:left="3600" w:hanging="360"/>
+      </w:pPr>
+    </w:lvl>
+    <w:lvl w:ilvl="5" w:tplc="FFFFFFFF" w:tentative="1">
+      <w:start w:val="1"/>
+      <w:numFmt w:val="lowerRoman"/>
+      <w:lvlText w:val="%6."/>
+      <w:lvlJc w:val="right"/>
+      <w:pPr>
+        <w:ind w:left="4320" w:hanging="180"/>
+      </w:pPr>
+    </w:lvl>
+    <w:lvl w:ilvl="6" w:tplc="FFFFFFFF" w:tentative="1">
+      <w:start w:val="1"/>
+      <w:numFmt w:val="decimal"/>
+      <w:lvlText w:val="%7."/>
+      <w:lvlJc w:val="left"/>
+      <w:pPr>
+        <w:ind w:left="5040" w:hanging="360"/>
+      </w:pPr>
+    </w:lvl>
+    <w:lvl w:ilvl="7" w:tplc="FFFFFFFF" w:tentative="1">
+      <w:start w:val="1"/>
+      <w:numFmt w:val="lowerLetter"/>
+      <w:lvlText w:val="%8."/>
+      <w:lvlJc w:val="left"/>
+      <w:pPr>
+        <w:ind w:left="5760" w:hanging="360"/>
+      </w:pPr>
+    </w:lvl>
+    <w:lvl w:ilvl="8" w:tplc="FFFFFFFF" w:tentative="1">
+      <w:start w:val="1"/>
+      <w:numFmt w:val="lowerRoman"/>
+      <w:lvlText w:val="%9."/>
+      <w:lvlJc w:val="right"/>
+      <w:pPr>
+        <w:ind w:left="6480" w:hanging="180"/>
+      </w:pPr>
+    </w:lvl>
+  </w:abstractNum>
+  <w:abstractNum w:abstractNumId="22" w15:restartNumberingAfterBreak="0">
     <w:nsid w:val="43AD7F85"/>
     <w:multiLevelType w:val="hybridMultilevel"/>
     <w:tmpl w:val="DB9C7302"/>
@@ -4066,7 +4497,7 @@
       </w:pPr>
     </w:lvl>
   </w:abstractNum>
-  <w:abstractNum w:abstractNumId="20" w15:restartNumberingAfterBreak="0">
+  <w:abstractNum w:abstractNumId="23" w15:restartNumberingAfterBreak="0">
     <w:nsid w:val="4554665C"/>
     <w:multiLevelType w:val="hybridMultilevel"/>
     <w:tmpl w:val="9530D958"/>
@@ -4155,7 +4586,7 @@
       </w:pPr>
     </w:lvl>
   </w:abstractNum>
-  <w:abstractNum w:abstractNumId="21" w15:restartNumberingAfterBreak="0">
+  <w:abstractNum w:abstractNumId="24" w15:restartNumberingAfterBreak="0">
     <w:nsid w:val="46D63F93"/>
     <w:multiLevelType w:val="hybridMultilevel"/>
     <w:tmpl w:val="74544868"/>
@@ -4241,7 +4672,93 @@
       </w:pPr>
     </w:lvl>
   </w:abstractNum>
-  <w:abstractNum w:abstractNumId="22" w15:restartNumberingAfterBreak="0">
+  <w:abstractNum w:abstractNumId="25" w15:restartNumberingAfterBreak="0">
+    <w:nsid w:val="4E654BB7"/>
+    <w:multiLevelType w:val="hybridMultilevel"/>
+    <w:tmpl w:val="C8C00276"/>
+    <w:lvl w:ilvl="0" w:tplc="FFFFFFFF">
+      <w:start w:val="1"/>
+      <w:numFmt w:val="decimal"/>
+      <w:lvlText w:val="%1."/>
+      <w:lvlJc w:val="left"/>
+      <w:pPr>
+        <w:ind w:left="720" w:hanging="360"/>
+      </w:pPr>
+    </w:lvl>
+    <w:lvl w:ilvl="1" w:tplc="0C0A0019" w:tentative="1">
+      <w:start w:val="1"/>
+      <w:numFmt w:val="lowerLetter"/>
+      <w:lvlText w:val="%2."/>
+      <w:lvlJc w:val="left"/>
+      <w:pPr>
+        <w:ind w:left="1440" w:hanging="360"/>
+      </w:pPr>
+    </w:lvl>
+    <w:lvl w:ilvl="2" w:tplc="0C0A001B" w:tentative="1">
+      <w:start w:val="1"/>
+      <w:numFmt w:val="lowerRoman"/>
+      <w:lvlText w:val="%3."/>
+      <w:lvlJc w:val="right"/>
+      <w:pPr>
+        <w:ind w:left="2160" w:hanging="180"/>
+      </w:pPr>
+    </w:lvl>
+    <w:lvl w:ilvl="3" w:tplc="0C0A000F" w:tentative="1">
+      <w:start w:val="1"/>
+      <w:numFmt w:val="decimal"/>
+      <w:lvlText w:val="%4."/>
+      <w:lvlJc w:val="left"/>
+      <w:pPr>
+        <w:ind w:left="2880" w:hanging="360"/>
+      </w:pPr>
+    </w:lvl>
+    <w:lvl w:ilvl="4" w:tplc="0C0A0019" w:tentative="1">
+      <w:start w:val="1"/>
+      <w:numFmt w:val="lowerLetter"/>
+      <w:lvlText w:val="%5."/>
+      <w:lvlJc w:val="left"/>
+      <w:pPr>
+        <w:ind w:left="3600" w:hanging="360"/>
+      </w:pPr>
+    </w:lvl>
+    <w:lvl w:ilvl="5" w:tplc="0C0A001B" w:tentative="1">
+      <w:start w:val="1"/>
+      <w:numFmt w:val="lowerRoman"/>
+      <w:lvlText w:val="%6."/>
+      <w:lvlJc w:val="right"/>
+      <w:pPr>
+        <w:ind w:left="4320" w:hanging="180"/>
+      </w:pPr>
+    </w:lvl>
+    <w:lvl w:ilvl="6" w:tplc="0C0A000F" w:tentative="1">
+      <w:start w:val="1"/>
+      <w:numFmt w:val="decimal"/>
+      <w:lvlText w:val="%7."/>
+      <w:lvlJc w:val="left"/>
+      <w:pPr>
+        <w:ind w:left="5040" w:hanging="360"/>
+      </w:pPr>
+    </w:lvl>
+    <w:lvl w:ilvl="7" w:tplc="0C0A0019" w:tentative="1">
+      <w:start w:val="1"/>
+      <w:numFmt w:val="lowerLetter"/>
+      <w:lvlText w:val="%8."/>
+      <w:lvlJc w:val="left"/>
+      <w:pPr>
+        <w:ind w:left="5760" w:hanging="360"/>
+      </w:pPr>
+    </w:lvl>
+    <w:lvl w:ilvl="8" w:tplc="0C0A001B" w:tentative="1">
+      <w:start w:val="1"/>
+      <w:numFmt w:val="lowerRoman"/>
+      <w:lvlText w:val="%9."/>
+      <w:lvlJc w:val="right"/>
+      <w:pPr>
+        <w:ind w:left="6480" w:hanging="180"/>
+      </w:pPr>
+    </w:lvl>
+  </w:abstractNum>
+  <w:abstractNum w:abstractNumId="26" w15:restartNumberingAfterBreak="0">
     <w:nsid w:val="4E915215"/>
     <w:multiLevelType w:val="hybridMultilevel"/>
     <w:tmpl w:val="4DBEC874"/>
@@ -4327,7 +4844,7 @@
       </w:pPr>
     </w:lvl>
   </w:abstractNum>
-  <w:abstractNum w:abstractNumId="23" w15:restartNumberingAfterBreak="0">
+  <w:abstractNum w:abstractNumId="27" w15:restartNumberingAfterBreak="0">
     <w:nsid w:val="5C96253E"/>
     <w:multiLevelType w:val="hybridMultilevel"/>
     <w:tmpl w:val="0220D50A"/>
@@ -4413,7 +4930,7 @@
       </w:pPr>
     </w:lvl>
   </w:abstractNum>
-  <w:abstractNum w:abstractNumId="24" w15:restartNumberingAfterBreak="0">
+  <w:abstractNum w:abstractNumId="28" w15:restartNumberingAfterBreak="0">
     <w:nsid w:val="5F6F009D"/>
     <w:multiLevelType w:val="hybridMultilevel"/>
     <w:tmpl w:val="5CF0BADE"/>
@@ -4499,7 +5016,93 @@
       </w:pPr>
     </w:lvl>
   </w:abstractNum>
-  <w:abstractNum w:abstractNumId="25" w15:restartNumberingAfterBreak="0">
+  <w:abstractNum w:abstractNumId="29" w15:restartNumberingAfterBreak="0">
+    <w:nsid w:val="616D6529"/>
+    <w:multiLevelType w:val="hybridMultilevel"/>
+    <w:tmpl w:val="9A5C23B6"/>
+    <w:lvl w:ilvl="0" w:tplc="FFFFFFFF">
+      <w:start w:val="1"/>
+      <w:numFmt w:val="decimal"/>
+      <w:lvlText w:val="%1."/>
+      <w:lvlJc w:val="left"/>
+      <w:pPr>
+        <w:ind w:left="720" w:hanging="360"/>
+      </w:pPr>
+    </w:lvl>
+    <w:lvl w:ilvl="1" w:tplc="FFFFFFFF" w:tentative="1">
+      <w:start w:val="1"/>
+      <w:numFmt w:val="lowerLetter"/>
+      <w:lvlText w:val="%2."/>
+      <w:lvlJc w:val="left"/>
+      <w:pPr>
+        <w:ind w:left="1440" w:hanging="360"/>
+      </w:pPr>
+    </w:lvl>
+    <w:lvl w:ilvl="2" w:tplc="FFFFFFFF" w:tentative="1">
+      <w:start w:val="1"/>
+      <w:numFmt w:val="lowerRoman"/>
+      <w:lvlText w:val="%3."/>
+      <w:lvlJc w:val="right"/>
+      <w:pPr>
+        <w:ind w:left="2160" w:hanging="180"/>
+      </w:pPr>
+    </w:lvl>
+    <w:lvl w:ilvl="3" w:tplc="FFFFFFFF" w:tentative="1">
+      <w:start w:val="1"/>
+      <w:numFmt w:val="decimal"/>
+      <w:lvlText w:val="%4."/>
+      <w:lvlJc w:val="left"/>
+      <w:pPr>
+        <w:ind w:left="2880" w:hanging="360"/>
+      </w:pPr>
+    </w:lvl>
+    <w:lvl w:ilvl="4" w:tplc="FFFFFFFF" w:tentative="1">
+      <w:start w:val="1"/>
+      <w:numFmt w:val="lowerLetter"/>
+      <w:lvlText w:val="%5."/>
+      <w:lvlJc w:val="left"/>
+      <w:pPr>
+        <w:ind w:left="3600" w:hanging="360"/>
+      </w:pPr>
+    </w:lvl>
+    <w:lvl w:ilvl="5" w:tplc="FFFFFFFF" w:tentative="1">
+      <w:start w:val="1"/>
+      <w:numFmt w:val="lowerRoman"/>
+      <w:lvlText w:val="%6."/>
+      <w:lvlJc w:val="right"/>
+      <w:pPr>
+        <w:ind w:left="4320" w:hanging="180"/>
+      </w:pPr>
+    </w:lvl>
+    <w:lvl w:ilvl="6" w:tplc="FFFFFFFF" w:tentative="1">
+      <w:start w:val="1"/>
+      <w:numFmt w:val="decimal"/>
+      <w:lvlText w:val="%7."/>
+      <w:lvlJc w:val="left"/>
+      <w:pPr>
+        <w:ind w:left="5040" w:hanging="360"/>
+      </w:pPr>
+    </w:lvl>
+    <w:lvl w:ilvl="7" w:tplc="FFFFFFFF" w:tentative="1">
+      <w:start w:val="1"/>
+      <w:numFmt w:val="lowerLetter"/>
+      <w:lvlText w:val="%8."/>
+      <w:lvlJc w:val="left"/>
+      <w:pPr>
+        <w:ind w:left="5760" w:hanging="360"/>
+      </w:pPr>
+    </w:lvl>
+    <w:lvl w:ilvl="8" w:tplc="FFFFFFFF" w:tentative="1">
+      <w:start w:val="1"/>
+      <w:numFmt w:val="lowerRoman"/>
+      <w:lvlText w:val="%9."/>
+      <w:lvlJc w:val="right"/>
+      <w:pPr>
+        <w:ind w:left="6480" w:hanging="180"/>
+      </w:pPr>
+    </w:lvl>
+  </w:abstractNum>
+  <w:abstractNum w:abstractNumId="30" w15:restartNumberingAfterBreak="0">
     <w:nsid w:val="65A413B5"/>
     <w:multiLevelType w:val="hybridMultilevel"/>
     <w:tmpl w:val="6116F71A"/>
@@ -4585,7 +5188,7 @@
       </w:pPr>
     </w:lvl>
   </w:abstractNum>
-  <w:abstractNum w:abstractNumId="26" w15:restartNumberingAfterBreak="0">
+  <w:abstractNum w:abstractNumId="31" w15:restartNumberingAfterBreak="0">
     <w:nsid w:val="65F072D9"/>
     <w:multiLevelType w:val="hybridMultilevel"/>
     <w:tmpl w:val="9A5C23B6"/>
@@ -4671,7 +5274,7 @@
       </w:pPr>
     </w:lvl>
   </w:abstractNum>
-  <w:abstractNum w:abstractNumId="27" w15:restartNumberingAfterBreak="0">
+  <w:abstractNum w:abstractNumId="32" w15:restartNumberingAfterBreak="0">
     <w:nsid w:val="68ED0C0D"/>
     <w:multiLevelType w:val="hybridMultilevel"/>
     <w:tmpl w:val="107472FA"/>
@@ -4757,7 +5360,7 @@
       </w:pPr>
     </w:lvl>
   </w:abstractNum>
-  <w:abstractNum w:abstractNumId="28" w15:restartNumberingAfterBreak="0">
+  <w:abstractNum w:abstractNumId="33" w15:restartNumberingAfterBreak="0">
     <w:nsid w:val="6EFD2AB4"/>
     <w:multiLevelType w:val="hybridMultilevel"/>
     <w:tmpl w:val="05AE3720"/>
@@ -4843,7 +5446,93 @@
       </w:pPr>
     </w:lvl>
   </w:abstractNum>
-  <w:abstractNum w:abstractNumId="29" w15:restartNumberingAfterBreak="0">
+  <w:abstractNum w:abstractNumId="34" w15:restartNumberingAfterBreak="0">
+    <w:nsid w:val="71CB4F6D"/>
+    <w:multiLevelType w:val="hybridMultilevel"/>
+    <w:tmpl w:val="7E620648"/>
+    <w:lvl w:ilvl="0" w:tplc="FFFFFFFF">
+      <w:start w:val="1"/>
+      <w:numFmt w:val="decimal"/>
+      <w:lvlText w:val="%1."/>
+      <w:lvlJc w:val="left"/>
+      <w:pPr>
+        <w:ind w:left="720" w:hanging="360"/>
+      </w:pPr>
+    </w:lvl>
+    <w:lvl w:ilvl="1" w:tplc="0C0A0019" w:tentative="1">
+      <w:start w:val="1"/>
+      <w:numFmt w:val="lowerLetter"/>
+      <w:lvlText w:val="%2."/>
+      <w:lvlJc w:val="left"/>
+      <w:pPr>
+        <w:ind w:left="1440" w:hanging="360"/>
+      </w:pPr>
+    </w:lvl>
+    <w:lvl w:ilvl="2" w:tplc="0C0A001B" w:tentative="1">
+      <w:start w:val="1"/>
+      <w:numFmt w:val="lowerRoman"/>
+      <w:lvlText w:val="%3."/>
+      <w:lvlJc w:val="right"/>
+      <w:pPr>
+        <w:ind w:left="2160" w:hanging="180"/>
+      </w:pPr>
+    </w:lvl>
+    <w:lvl w:ilvl="3" w:tplc="0C0A000F" w:tentative="1">
+      <w:start w:val="1"/>
+      <w:numFmt w:val="decimal"/>
+      <w:lvlText w:val="%4."/>
+      <w:lvlJc w:val="left"/>
+      <w:pPr>
+        <w:ind w:left="2880" w:hanging="360"/>
+      </w:pPr>
+    </w:lvl>
+    <w:lvl w:ilvl="4" w:tplc="0C0A0019" w:tentative="1">
+      <w:start w:val="1"/>
+      <w:numFmt w:val="lowerLetter"/>
+      <w:lvlText w:val="%5."/>
+      <w:lvlJc w:val="left"/>
+      <w:pPr>
+        <w:ind w:left="3600" w:hanging="360"/>
+      </w:pPr>
+    </w:lvl>
+    <w:lvl w:ilvl="5" w:tplc="0C0A001B" w:tentative="1">
+      <w:start w:val="1"/>
+      <w:numFmt w:val="lowerRoman"/>
+      <w:lvlText w:val="%6."/>
+      <w:lvlJc w:val="right"/>
+      <w:pPr>
+        <w:ind w:left="4320" w:hanging="180"/>
+      </w:pPr>
+    </w:lvl>
+    <w:lvl w:ilvl="6" w:tplc="0C0A000F" w:tentative="1">
+      <w:start w:val="1"/>
+      <w:numFmt w:val="decimal"/>
+      <w:lvlText w:val="%7."/>
+      <w:lvlJc w:val="left"/>
+      <w:pPr>
+        <w:ind w:left="5040" w:hanging="360"/>
+      </w:pPr>
+    </w:lvl>
+    <w:lvl w:ilvl="7" w:tplc="0C0A0019" w:tentative="1">
+      <w:start w:val="1"/>
+      <w:numFmt w:val="lowerLetter"/>
+      <w:lvlText w:val="%8."/>
+      <w:lvlJc w:val="left"/>
+      <w:pPr>
+        <w:ind w:left="5760" w:hanging="360"/>
+      </w:pPr>
+    </w:lvl>
+    <w:lvl w:ilvl="8" w:tplc="0C0A001B" w:tentative="1">
+      <w:start w:val="1"/>
+      <w:numFmt w:val="lowerRoman"/>
+      <w:lvlText w:val="%9."/>
+      <w:lvlJc w:val="right"/>
+      <w:pPr>
+        <w:ind w:left="6480" w:hanging="180"/>
+      </w:pPr>
+    </w:lvl>
+  </w:abstractNum>
+  <w:abstractNum w:abstractNumId="35" w15:restartNumberingAfterBreak="0">
     <w:nsid w:val="77A67E4B"/>
     <w:multiLevelType w:val="hybridMultilevel"/>
     <w:tmpl w:val="7E388D94"/>
@@ -4956,7 +5645,7 @@
       </w:rPr>
     </w:lvl>
   </w:abstractNum>
-  <w:abstractNum w:abstractNumId="30" w15:restartNumberingAfterBreak="0">
+  <w:abstractNum w:abstractNumId="36" w15:restartNumberingAfterBreak="0">
     <w:nsid w:val="7D213319"/>
     <w:multiLevelType w:val="hybridMultilevel"/>
     <w:tmpl w:val="7DE08758"/>
@@ -5042,7 +5731,7 @@
       </w:pPr>
     </w:lvl>
   </w:abstractNum>
-  <w:abstractNum w:abstractNumId="31" w15:restartNumberingAfterBreak="0">
+  <w:abstractNum w:abstractNumId="37" w15:restartNumberingAfterBreak="0">
     <w:nsid w:val="7F46763F"/>
     <w:multiLevelType w:val="hybridMultilevel"/>
     <w:tmpl w:val="5C80FA16"/>
@@ -5129,100 +5818,118 @@
     </w:lvl>
   </w:abstractNum>
   <w:num w:numId="1" w16cid:durableId="101069171">
-    <w:abstractNumId w:val="29"/>
+    <w:abstractNumId w:val="35"/>
   </w:num>
   <w:num w:numId="2" w16cid:durableId="1786266961">
-    <w:abstractNumId w:val="16"/>
+    <w:abstractNumId w:val="18"/>
   </w:num>
   <w:num w:numId="3" w16cid:durableId="149911408">
+    <w:abstractNumId w:val="23"/>
+  </w:num>
+  <w:num w:numId="4" w16cid:durableId="1362392822">
+    <w:abstractNumId w:val="4"/>
+  </w:num>
+  <w:num w:numId="5" w16cid:durableId="438839516">
+    <w:abstractNumId w:val="2"/>
+  </w:num>
+  <w:num w:numId="6" w16cid:durableId="856819041">
+    <w:abstractNumId w:val="3"/>
+  </w:num>
+  <w:num w:numId="7" w16cid:durableId="365251026">
+    <w:abstractNumId w:val="13"/>
+  </w:num>
+  <w:num w:numId="8" w16cid:durableId="114450418">
+    <w:abstractNumId w:val="9"/>
+  </w:num>
+  <w:num w:numId="9" w16cid:durableId="1974405138">
+    <w:abstractNumId w:val="22"/>
+  </w:num>
+  <w:num w:numId="10" w16cid:durableId="1647278528">
+    <w:abstractNumId w:val="7"/>
+  </w:num>
+  <w:num w:numId="11" w16cid:durableId="1197932737">
+    <w:abstractNumId w:val="6"/>
+  </w:num>
+  <w:num w:numId="12" w16cid:durableId="1620407295">
     <w:abstractNumId w:val="20"/>
   </w:num>
-  <w:num w:numId="4" w16cid:durableId="1362392822">
-    <w:abstractNumId w:val="3"/>
-  </w:num>
-  <w:num w:numId="5" w16cid:durableId="438839516">
-    <w:abstractNumId w:val="1"/>
-  </w:num>
-  <w:num w:numId="6" w16cid:durableId="856819041">
-    <w:abstractNumId w:val="2"/>
-  </w:num>
-  <w:num w:numId="7" w16cid:durableId="365251026">
-    <w:abstractNumId w:val="12"/>
-  </w:num>
-  <w:num w:numId="8" w16cid:durableId="114450418">
-    <w:abstractNumId w:val="8"/>
-  </w:num>
-  <w:num w:numId="9" w16cid:durableId="1974405138">
-    <w:abstractNumId w:val="19"/>
-  </w:num>
-  <w:num w:numId="10" w16cid:durableId="1647278528">
-    <w:abstractNumId w:val="6"/>
-  </w:num>
-  <w:num w:numId="11" w16cid:durableId="1197932737">
-    <w:abstractNumId w:val="5"/>
-  </w:num>
-  <w:num w:numId="12" w16cid:durableId="1620407295">
-    <w:abstractNumId w:val="18"/>
-  </w:num>
   <w:num w:numId="13" w16cid:durableId="1248349841">
-    <w:abstractNumId w:val="22"/>
+    <w:abstractNumId w:val="26"/>
   </w:num>
   <w:num w:numId="14" w16cid:durableId="1717468140">
-    <w:abstractNumId w:val="25"/>
+    <w:abstractNumId w:val="30"/>
   </w:num>
   <w:num w:numId="15" w16cid:durableId="549458023">
-    <w:abstractNumId w:val="27"/>
+    <w:abstractNumId w:val="32"/>
   </w:num>
   <w:num w:numId="16" w16cid:durableId="1881282886">
-    <w:abstractNumId w:val="14"/>
+    <w:abstractNumId w:val="15"/>
   </w:num>
   <w:num w:numId="17" w16cid:durableId="2044595042">
-    <w:abstractNumId w:val="24"/>
+    <w:abstractNumId w:val="28"/>
   </w:num>
   <w:num w:numId="18" w16cid:durableId="597910982">
-    <w:abstractNumId w:val="10"/>
+    <w:abstractNumId w:val="11"/>
   </w:num>
   <w:num w:numId="19" w16cid:durableId="771587780">
     <w:abstractNumId w:val="0"/>
   </w:num>
   <w:num w:numId="20" w16cid:durableId="1168599682">
-    <w:abstractNumId w:val="15"/>
+    <w:abstractNumId w:val="17"/>
   </w:num>
   <w:num w:numId="21" w16cid:durableId="1072115651">
-    <w:abstractNumId w:val="4"/>
+    <w:abstractNumId w:val="5"/>
   </w:num>
   <w:num w:numId="22" w16cid:durableId="1015308523">
-    <w:abstractNumId w:val="28"/>
+    <w:abstractNumId w:val="33"/>
   </w:num>
   <w:num w:numId="23" w16cid:durableId="1326783984">
+    <w:abstractNumId w:val="24"/>
+  </w:num>
+  <w:num w:numId="24" w16cid:durableId="1174951598">
+    <w:abstractNumId w:val="10"/>
+  </w:num>
+  <w:num w:numId="25" w16cid:durableId="1541474199">
+    <w:abstractNumId w:val="27"/>
+  </w:num>
+  <w:num w:numId="26" w16cid:durableId="2018842846">
+    <w:abstractNumId w:val="19"/>
+  </w:num>
+  <w:num w:numId="27" w16cid:durableId="88434618">
+    <w:abstractNumId w:val="36"/>
+  </w:num>
+  <w:num w:numId="28" w16cid:durableId="1401172460">
+    <w:abstractNumId w:val="8"/>
+  </w:num>
+  <w:num w:numId="29" w16cid:durableId="544684215">
+    <w:abstractNumId w:val="37"/>
+  </w:num>
+  <w:num w:numId="30" w16cid:durableId="1369145286">
+    <w:abstractNumId w:val="14"/>
+  </w:num>
+  <w:num w:numId="31" w16cid:durableId="1690332693">
+    <w:abstractNumId w:val="31"/>
+  </w:num>
+  <w:num w:numId="32" w16cid:durableId="630138142">
+    <w:abstractNumId w:val="12"/>
+  </w:num>
+  <w:num w:numId="33" w16cid:durableId="654142582">
     <w:abstractNumId w:val="21"/>
   </w:num>
-  <w:num w:numId="24" w16cid:durableId="1174951598">
-    <w:abstractNumId w:val="9"/>
+  <w:num w:numId="34" w16cid:durableId="645935883">
+    <w:abstractNumId w:val="34"/>
   </w:num>
-  <w:num w:numId="25" w16cid:durableId="1541474199">
-    <w:abstractNumId w:val="23"/>
+  <w:num w:numId="35" w16cid:durableId="796526302">
+    <w:abstractNumId w:val="29"/>
   </w:num>
-  <w:num w:numId="26" w16cid:durableId="2018842846">
-    <w:abstractNumId w:val="17"/>
+  <w:num w:numId="36" w16cid:durableId="475607778">
+    <w:abstractNumId w:val="16"/>
   </w:num>
-  <w:num w:numId="27" w16cid:durableId="88434618">
-    <w:abstractNumId w:val="30"/>
+  <w:num w:numId="37" w16cid:durableId="698821017">
+    <w:abstractNumId w:val="1"/>
   </w:num>
-  <w:num w:numId="28" w16cid:durableId="1401172460">
-    <w:abstractNumId w:val="7"/>
-  </w:num>
-  <w:num w:numId="29" w16cid:durableId="544684215">
-    <w:abstractNumId w:val="31"/>
-  </w:num>
-  <w:num w:numId="30" w16cid:durableId="1369145286">
-    <w:abstractNumId w:val="13"/>
-  </w:num>
-  <w:num w:numId="31" w16cid:durableId="1690332693">
-    <w:abstractNumId w:val="26"/>
-  </w:num>
-  <w:num w:numId="32" w16cid:durableId="630138142">
-    <w:abstractNumId w:val="11"/>
+  <w:num w:numId="38" w16cid:durableId="1703821441">
+    <w:abstractNumId w:val="25"/>
   </w:num>
   <w:numIdMacAtCleanup w:val="5"/>
 </w:numbering>

</xml_diff>

<commit_message>
Se ha Implementado la Primera prueba de interfaz del metodo FiltrarPordistancia
</commit_message>
<xml_diff>
--- a/Docs/Test Plans/US532227-FiltrarEstacionesPorDistancia-TestPlan.docx
+++ b/Docs/Test Plans/US532227-FiltrarEstacionesPorDistancia-TestPlan.docx
@@ -721,691 +721,6 @@
         <w:autoSpaceDE w:val="0"/>
         <w:autoSpaceDN w:val="0"/>
         <w:adjustRightInd w:val="0"/>
-        <w:spacing w:after="0" w:line="240" w:lineRule="auto"/>
-      </w:pPr>
-      <w:r>
-        <w:t>Prueba 00. Éxito:</w:t>
-      </w:r>
-    </w:p>
-    <w:p>
-      <w:pPr>
-        <w:pStyle w:val="Prrafodelista"/>
-        <w:numPr>
-          <w:ilvl w:val="0"/>
-          <w:numId w:val="31"/>
-        </w:numPr>
-        <w:autoSpaceDE w:val="0"/>
-        <w:autoSpaceDN w:val="0"/>
-        <w:adjustRightInd w:val="0"/>
-        <w:spacing w:after="0" w:line="240" w:lineRule="auto"/>
-      </w:pPr>
-      <w:r>
-        <w:t>La aplicación solicita al técnico la distancia por la que desea filtrar (en Km).</w:t>
-      </w:r>
-    </w:p>
-    <w:p>
-      <w:pPr>
-        <w:pStyle w:val="Prrafodelista"/>
-        <w:numPr>
-          <w:ilvl w:val="0"/>
-          <w:numId w:val="31"/>
-        </w:numPr>
-        <w:autoSpaceDE w:val="0"/>
-        <w:autoSpaceDN w:val="0"/>
-        <w:adjustRightInd w:val="0"/>
-        <w:spacing w:after="0" w:line="240" w:lineRule="auto"/>
-      </w:pPr>
-      <w:r>
-        <w:t xml:space="preserve">El técnico introduce </w:t>
-      </w:r>
-      <w:r>
-        <w:t xml:space="preserve">5Km </w:t>
-      </w:r>
-      <w:r>
-        <w:t>en la aplicación.</w:t>
-      </w:r>
-    </w:p>
-    <w:p>
-      <w:pPr>
-        <w:pStyle w:val="Prrafodelista"/>
-        <w:numPr>
-          <w:ilvl w:val="0"/>
-          <w:numId w:val="31"/>
-        </w:numPr>
-        <w:autoSpaceDE w:val="0"/>
-        <w:autoSpaceDN w:val="0"/>
-        <w:adjustRightInd w:val="0"/>
-        <w:spacing w:after="0" w:line="240" w:lineRule="auto"/>
-      </w:pPr>
-      <w:r>
-        <w:t>La aplicación comprueba que la distancia introducida es válida.</w:t>
-      </w:r>
-    </w:p>
-    <w:p>
-      <w:pPr>
-        <w:pStyle w:val="Prrafodelista"/>
-        <w:numPr>
-          <w:ilvl w:val="0"/>
-          <w:numId w:val="31"/>
-        </w:numPr>
-        <w:autoSpaceDE w:val="0"/>
-        <w:autoSpaceDN w:val="0"/>
-        <w:adjustRightInd w:val="0"/>
-        <w:spacing w:after="0" w:line="240" w:lineRule="auto"/>
-      </w:pPr>
-      <w:r>
-        <w:t>La aplicación solicita al técnico si desea ver las estaciones a una distancia inferior o superior al límite establecido.</w:t>
-      </w:r>
-    </w:p>
-    <w:p>
-      <w:pPr>
-        <w:pStyle w:val="Prrafodelista"/>
-        <w:numPr>
-          <w:ilvl w:val="0"/>
-          <w:numId w:val="31"/>
-        </w:numPr>
-        <w:autoSpaceDE w:val="0"/>
-        <w:autoSpaceDN w:val="0"/>
-        <w:adjustRightInd w:val="0"/>
-        <w:spacing w:after="0" w:line="240" w:lineRule="auto"/>
-      </w:pPr>
-      <w:r>
-        <w:t xml:space="preserve">El técnico selecciona en la aplicación la opción </w:t>
-      </w:r>
-      <w:r>
-        <w:t>de ver</w:t>
-      </w:r>
-      <w:r>
-        <w:t xml:space="preserve"> a una distancia </w:t>
-      </w:r>
-      <w:r>
-        <w:t>superior</w:t>
-      </w:r>
-      <w:r>
-        <w:t>.</w:t>
-      </w:r>
-    </w:p>
-    <w:p>
-      <w:pPr>
-        <w:pStyle w:val="Prrafodelista"/>
-        <w:numPr>
-          <w:ilvl w:val="0"/>
-          <w:numId w:val="31"/>
-        </w:numPr>
-        <w:autoSpaceDE w:val="0"/>
-        <w:autoSpaceDN w:val="0"/>
-        <w:adjustRightInd w:val="0"/>
-        <w:spacing w:after="0" w:line="240" w:lineRule="auto"/>
-      </w:pPr>
-      <w:r>
-        <w:t>La aplicación detecta que la geolocalización está disponible</w:t>
-      </w:r>
-    </w:p>
-    <w:p>
-      <w:pPr>
-        <w:pStyle w:val="Prrafodelista"/>
-        <w:numPr>
-          <w:ilvl w:val="0"/>
-          <w:numId w:val="31"/>
-        </w:numPr>
-        <w:autoSpaceDE w:val="0"/>
-        <w:autoSpaceDN w:val="0"/>
-        <w:adjustRightInd w:val="0"/>
-        <w:spacing w:after="0" w:line="240" w:lineRule="auto"/>
-      </w:pPr>
-      <w:r>
-        <w:t>La aplicación muestra las estaciones que cumplan el requisito de filtrado, ordenadas por distancia (de menor a mayor), con su nombre y la distancia.</w:t>
-      </w:r>
-    </w:p>
-    <w:p>
-      <w:pPr>
-        <w:pStyle w:val="Prrafodelista"/>
-        <w:numPr>
-          <w:ilvl w:val="0"/>
-          <w:numId w:val="31"/>
-        </w:numPr>
-        <w:autoSpaceDE w:val="0"/>
-        <w:autoSpaceDN w:val="0"/>
-        <w:adjustRightInd w:val="0"/>
-        <w:spacing w:after="0" w:line="240" w:lineRule="auto"/>
-      </w:pPr>
-      <w:r>
-        <w:t>Se verifica que las estaciones mostradas cumplen el requisito de filtrado y que todas las que lo cumplen se muestran.</w:t>
-      </w:r>
-    </w:p>
-    <w:p>
-      <w:pPr>
-        <w:pStyle w:val="Prrafodelista"/>
-        <w:numPr>
-          <w:ilvl w:val="0"/>
-          <w:numId w:val="31"/>
-        </w:numPr>
-        <w:autoSpaceDE w:val="0"/>
-        <w:autoSpaceDN w:val="0"/>
-        <w:adjustRightInd w:val="0"/>
-        <w:spacing w:after="0" w:line="240" w:lineRule="auto"/>
-      </w:pPr>
-      <w:r>
-        <w:t>Se verifica que las estaciones mostradas están ordenadas por distancia (de menor a mayor).</w:t>
-      </w:r>
-    </w:p>
-    <w:p>
-      <w:pPr>
-        <w:pStyle w:val="Prrafodelista"/>
-        <w:numPr>
-          <w:ilvl w:val="0"/>
-          <w:numId w:val="31"/>
-        </w:numPr>
-        <w:autoSpaceDE w:val="0"/>
-        <w:autoSpaceDN w:val="0"/>
-        <w:adjustRightInd w:val="0"/>
-        <w:spacing w:after="0" w:line="240" w:lineRule="auto"/>
-      </w:pPr>
-      <w:r>
-        <w:t>Se verifica que los datos mostrados de las estaciones son correctos.</w:t>
-      </w:r>
-    </w:p>
-    <w:p>
-      <w:pPr>
-        <w:autoSpaceDE w:val="0"/>
-        <w:autoSpaceDN w:val="0"/>
-        <w:adjustRightInd w:val="0"/>
-        <w:spacing w:after="0" w:line="240" w:lineRule="auto"/>
-        <w:ind w:left="708"/>
-      </w:pPr>
-    </w:p>
-    <w:p>
-      <w:pPr>
-        <w:autoSpaceDE w:val="0"/>
-        <w:autoSpaceDN w:val="0"/>
-        <w:adjustRightInd w:val="0"/>
-        <w:spacing w:after="0" w:line="240" w:lineRule="auto"/>
-      </w:pPr>
-      <w:r>
-        <w:t>Prueba 01. No existen estaciones en el rango de filtrado:</w:t>
-      </w:r>
-    </w:p>
-    <w:p>
-      <w:pPr>
-        <w:pStyle w:val="Prrafodelista"/>
-        <w:numPr>
-          <w:ilvl w:val="0"/>
-          <w:numId w:val="24"/>
-        </w:numPr>
-        <w:autoSpaceDE w:val="0"/>
-        <w:autoSpaceDN w:val="0"/>
-        <w:adjustRightInd w:val="0"/>
-        <w:spacing w:after="0" w:line="240" w:lineRule="auto"/>
-      </w:pPr>
-      <w:r>
-        <w:t>La aplicación detecta que la geolocalización está disponible</w:t>
-      </w:r>
-    </w:p>
-    <w:p>
-      <w:pPr>
-        <w:pStyle w:val="Prrafodelista"/>
-        <w:numPr>
-          <w:ilvl w:val="0"/>
-          <w:numId w:val="24"/>
-        </w:numPr>
-        <w:autoSpaceDE w:val="0"/>
-        <w:autoSpaceDN w:val="0"/>
-        <w:adjustRightInd w:val="0"/>
-        <w:spacing w:after="0" w:line="240" w:lineRule="auto"/>
-      </w:pPr>
-      <w:r>
-        <w:t>La aplicación solicita al técnico la distancia por la que desea filtrar (en Km).</w:t>
-      </w:r>
-    </w:p>
-    <w:p>
-      <w:pPr>
-        <w:pStyle w:val="Prrafodelista"/>
-        <w:numPr>
-          <w:ilvl w:val="0"/>
-          <w:numId w:val="24"/>
-        </w:numPr>
-        <w:autoSpaceDE w:val="0"/>
-        <w:autoSpaceDN w:val="0"/>
-        <w:adjustRightInd w:val="0"/>
-        <w:spacing w:after="0" w:line="240" w:lineRule="auto"/>
-      </w:pPr>
-      <w:r>
-        <w:t xml:space="preserve">El técnico introduce en la aplicación la distancia </w:t>
-      </w:r>
-      <w:r>
-        <w:t>1km</w:t>
-      </w:r>
-      <w:r>
-        <w:t>.</w:t>
-      </w:r>
-    </w:p>
-    <w:p>
-      <w:pPr>
-        <w:pStyle w:val="Prrafodelista"/>
-        <w:numPr>
-          <w:ilvl w:val="0"/>
-          <w:numId w:val="24"/>
-        </w:numPr>
-        <w:autoSpaceDE w:val="0"/>
-        <w:autoSpaceDN w:val="0"/>
-        <w:adjustRightInd w:val="0"/>
-        <w:spacing w:after="0" w:line="240" w:lineRule="auto"/>
-      </w:pPr>
-      <w:r>
-        <w:t>La aplicación comprueba que la distancia introducida es válida.</w:t>
-      </w:r>
-    </w:p>
-    <w:p>
-      <w:pPr>
-        <w:pStyle w:val="Prrafodelista"/>
-        <w:numPr>
-          <w:ilvl w:val="0"/>
-          <w:numId w:val="24"/>
-        </w:numPr>
-        <w:autoSpaceDE w:val="0"/>
-        <w:autoSpaceDN w:val="0"/>
-        <w:adjustRightInd w:val="0"/>
-        <w:spacing w:after="0" w:line="240" w:lineRule="auto"/>
-      </w:pPr>
-      <w:r>
-        <w:t>La aplicación solicita al técnico si desea ver las estaciones a una distancia inferior o superior al límite establecido.</w:t>
-      </w:r>
-    </w:p>
-    <w:p>
-      <w:pPr>
-        <w:pStyle w:val="Prrafodelista"/>
-        <w:numPr>
-          <w:ilvl w:val="0"/>
-          <w:numId w:val="24"/>
-        </w:numPr>
-        <w:autoSpaceDE w:val="0"/>
-        <w:autoSpaceDN w:val="0"/>
-        <w:adjustRightInd w:val="0"/>
-        <w:spacing w:after="0" w:line="240" w:lineRule="auto"/>
-      </w:pPr>
-      <w:r>
-        <w:t xml:space="preserve">El técnico selecciona en la aplicación la opción </w:t>
-      </w:r>
-      <w:r>
-        <w:t>distancia inferior</w:t>
-      </w:r>
-      <w:r>
-        <w:t>.</w:t>
-      </w:r>
-    </w:p>
-    <w:p>
-      <w:pPr>
-        <w:pStyle w:val="Prrafodelista"/>
-        <w:numPr>
-          <w:ilvl w:val="0"/>
-          <w:numId w:val="24"/>
-        </w:numPr>
-        <w:autoSpaceDE w:val="0"/>
-        <w:autoSpaceDN w:val="0"/>
-        <w:adjustRightInd w:val="0"/>
-        <w:spacing w:after="0" w:line="240" w:lineRule="auto"/>
-      </w:pPr>
-      <w:r>
-        <w:t>La aplicación detecta que la geolocalización está disponible</w:t>
-      </w:r>
-    </w:p>
-    <w:p>
-      <w:pPr>
-        <w:pStyle w:val="Prrafodelista"/>
-        <w:numPr>
-          <w:ilvl w:val="0"/>
-          <w:numId w:val="24"/>
-        </w:numPr>
-        <w:autoSpaceDE w:val="0"/>
-        <w:autoSpaceDN w:val="0"/>
-        <w:adjustRightInd w:val="0"/>
-        <w:spacing w:after="0" w:line="240" w:lineRule="auto"/>
-      </w:pPr>
-      <w:r>
-        <w:t>La aplicación detecta que no hay estaciones en el rango de filtrado.</w:t>
-      </w:r>
-    </w:p>
-    <w:p>
-      <w:pPr>
-        <w:pStyle w:val="Prrafodelista"/>
-        <w:numPr>
-          <w:ilvl w:val="0"/>
-          <w:numId w:val="24"/>
-        </w:numPr>
-        <w:autoSpaceDE w:val="0"/>
-        <w:autoSpaceDN w:val="0"/>
-        <w:adjustRightInd w:val="0"/>
-        <w:spacing w:after="0" w:line="240" w:lineRule="auto"/>
-      </w:pPr>
-      <w:r>
-        <w:t xml:space="preserve">Se verifica que la aplicación notifica al técnico </w:t>
-      </w:r>
-      <w:r>
-        <w:t>con el mensaje “N</w:t>
-      </w:r>
-      <w:r>
-        <w:t>o hay estaciones en el rango deseado</w:t>
-      </w:r>
-      <w:r>
-        <w:t>”</w:t>
-      </w:r>
-      <w:r>
-        <w:t>.</w:t>
-      </w:r>
-    </w:p>
-    <w:p>
-      <w:pPr>
-        <w:autoSpaceDE w:val="0"/>
-        <w:autoSpaceDN w:val="0"/>
-        <w:adjustRightInd w:val="0"/>
-        <w:spacing w:after="0" w:line="240" w:lineRule="auto"/>
-      </w:pPr>
-    </w:p>
-    <w:p>
-      <w:pPr>
-        <w:autoSpaceDE w:val="0"/>
-        <w:autoSpaceDN w:val="0"/>
-        <w:adjustRightInd w:val="0"/>
-        <w:spacing w:after="0" w:line="240" w:lineRule="auto"/>
-      </w:pPr>
-      <w:r>
-        <w:t>Prueba 02. Distancia introducida inválida:</w:t>
-      </w:r>
-    </w:p>
-    <w:p>
-      <w:pPr>
-        <w:autoSpaceDE w:val="0"/>
-        <w:autoSpaceDN w:val="0"/>
-        <w:adjustRightInd w:val="0"/>
-        <w:spacing w:after="0" w:line="240" w:lineRule="auto"/>
-      </w:pPr>
-      <w:r>
-        <w:t>Nota: Una distancia será inválida bien si es negativa o bien si tiene decimales.</w:t>
-      </w:r>
-    </w:p>
-    <w:p>
-      <w:pPr>
-        <w:pStyle w:val="Prrafodelista"/>
-        <w:numPr>
-          <w:ilvl w:val="0"/>
-          <w:numId w:val="25"/>
-        </w:numPr>
-        <w:autoSpaceDE w:val="0"/>
-        <w:autoSpaceDN w:val="0"/>
-        <w:adjustRightInd w:val="0"/>
-        <w:spacing w:after="0" w:line="240" w:lineRule="auto"/>
-      </w:pPr>
-      <w:r>
-        <w:t>La aplicación detecta que la geolocalización está disponible</w:t>
-      </w:r>
-    </w:p>
-    <w:p>
-      <w:pPr>
-        <w:pStyle w:val="Prrafodelista"/>
-        <w:numPr>
-          <w:ilvl w:val="0"/>
-          <w:numId w:val="25"/>
-        </w:numPr>
-        <w:autoSpaceDE w:val="0"/>
-        <w:autoSpaceDN w:val="0"/>
-        <w:adjustRightInd w:val="0"/>
-        <w:spacing w:after="0" w:line="240" w:lineRule="auto"/>
-      </w:pPr>
-      <w:r>
-        <w:t>La aplicación solicita al técnico la distancia por la que desea filtrar (en Km).</w:t>
-      </w:r>
-    </w:p>
-    <w:p>
-      <w:pPr>
-        <w:pStyle w:val="Prrafodelista"/>
-        <w:numPr>
-          <w:ilvl w:val="0"/>
-          <w:numId w:val="25"/>
-        </w:numPr>
-        <w:autoSpaceDE w:val="0"/>
-        <w:autoSpaceDN w:val="0"/>
-        <w:adjustRightInd w:val="0"/>
-        <w:spacing w:after="0" w:line="240" w:lineRule="auto"/>
-      </w:pPr>
-      <w:r>
-        <w:t xml:space="preserve">El técnico intenta introducir </w:t>
-      </w:r>
-      <w:r>
-        <w:t xml:space="preserve">-3Km </w:t>
-      </w:r>
-      <w:r>
-        <w:t>en la aplicación.</w:t>
-      </w:r>
-    </w:p>
-    <w:p>
-      <w:pPr>
-        <w:pStyle w:val="Prrafodelista"/>
-        <w:numPr>
-          <w:ilvl w:val="0"/>
-          <w:numId w:val="25"/>
-        </w:numPr>
-        <w:autoSpaceDE w:val="0"/>
-        <w:autoSpaceDN w:val="0"/>
-        <w:adjustRightInd w:val="0"/>
-        <w:spacing w:after="0" w:line="240" w:lineRule="auto"/>
-      </w:pPr>
-      <w:r>
-        <w:t>La aplicación detecta que la distancia que trata de introducir el técnico no es válida.</w:t>
-      </w:r>
-    </w:p>
-    <w:p>
-      <w:pPr>
-        <w:pStyle w:val="Prrafodelista"/>
-        <w:numPr>
-          <w:ilvl w:val="0"/>
-          <w:numId w:val="25"/>
-        </w:numPr>
-        <w:autoSpaceDE w:val="0"/>
-        <w:autoSpaceDN w:val="0"/>
-        <w:adjustRightInd w:val="0"/>
-        <w:spacing w:after="0" w:line="240" w:lineRule="auto"/>
-      </w:pPr>
-      <w:r>
-        <w:t>El sistema muestra el mensaje “Distancia no v</w:t>
-      </w:r>
-      <w:r>
-        <w:t>á</w:t>
-      </w:r>
-      <w:r>
-        <w:t xml:space="preserve">lida” y no </w:t>
-      </w:r>
-      <w:r>
-        <w:t>realiza</w:t>
-      </w:r>
-      <w:r>
-        <w:t xml:space="preserve"> el filtrado</w:t>
-      </w:r>
-      <w:r>
-        <w:t>.</w:t>
-      </w:r>
-    </w:p>
-    <w:p>
-      <w:pPr>
-        <w:autoSpaceDE w:val="0"/>
-        <w:autoSpaceDN w:val="0"/>
-        <w:adjustRightInd w:val="0"/>
-        <w:spacing w:after="0" w:line="240" w:lineRule="auto"/>
-      </w:pPr>
-    </w:p>
-    <w:p>
-      <w:pPr>
-        <w:autoSpaceDE w:val="0"/>
-        <w:autoSpaceDN w:val="0"/>
-        <w:adjustRightInd w:val="0"/>
-        <w:spacing w:after="0" w:line="240" w:lineRule="auto"/>
-      </w:pPr>
-      <w:r>
-        <w:t>Prueba 0</w:t>
-      </w:r>
-      <w:r>
-        <w:t>3</w:t>
-      </w:r>
-      <w:r>
-        <w:t>. Geolocalización no disponible:</w:t>
-      </w:r>
-    </w:p>
-    <w:p>
-      <w:pPr>
-        <w:pStyle w:val="Prrafodelista"/>
-        <w:numPr>
-          <w:ilvl w:val="0"/>
-          <w:numId w:val="38"/>
-        </w:numPr>
-        <w:autoSpaceDE w:val="0"/>
-        <w:autoSpaceDN w:val="0"/>
-        <w:adjustRightInd w:val="0"/>
-        <w:spacing w:after="0" w:line="240" w:lineRule="auto"/>
-      </w:pPr>
-      <w:r>
-        <w:t>La aplicación solicita al técnico la distancia por la que desea filtrar (en Km).</w:t>
-      </w:r>
-    </w:p>
-    <w:p>
-      <w:pPr>
-        <w:pStyle w:val="Prrafodelista"/>
-        <w:numPr>
-          <w:ilvl w:val="0"/>
-          <w:numId w:val="38"/>
-        </w:numPr>
-        <w:autoSpaceDE w:val="0"/>
-        <w:autoSpaceDN w:val="0"/>
-        <w:adjustRightInd w:val="0"/>
-        <w:spacing w:after="0" w:line="240" w:lineRule="auto"/>
-      </w:pPr>
-      <w:r>
-        <w:t>El técnico introduce 5Km en la aplicación.</w:t>
-      </w:r>
-    </w:p>
-    <w:p>
-      <w:pPr>
-        <w:pStyle w:val="Prrafodelista"/>
-        <w:numPr>
-          <w:ilvl w:val="0"/>
-          <w:numId w:val="38"/>
-        </w:numPr>
-        <w:autoSpaceDE w:val="0"/>
-        <w:autoSpaceDN w:val="0"/>
-        <w:adjustRightInd w:val="0"/>
-        <w:spacing w:after="0" w:line="240" w:lineRule="auto"/>
-      </w:pPr>
-      <w:r>
-        <w:t>La aplicación comprueba que la distancia introducida es válida.</w:t>
-      </w:r>
-    </w:p>
-    <w:p>
-      <w:pPr>
-        <w:pStyle w:val="Prrafodelista"/>
-        <w:numPr>
-          <w:ilvl w:val="0"/>
-          <w:numId w:val="38"/>
-        </w:numPr>
-        <w:autoSpaceDE w:val="0"/>
-        <w:autoSpaceDN w:val="0"/>
-        <w:adjustRightInd w:val="0"/>
-        <w:spacing w:after="0" w:line="240" w:lineRule="auto"/>
-      </w:pPr>
-      <w:r>
-        <w:t>La aplicación solicita al técnico si desea ver las estaciones a una distancia inferior o superior al límite establecido.</w:t>
-      </w:r>
-    </w:p>
-    <w:p>
-      <w:pPr>
-        <w:pStyle w:val="Prrafodelista"/>
-        <w:numPr>
-          <w:ilvl w:val="0"/>
-          <w:numId w:val="38"/>
-        </w:numPr>
-        <w:autoSpaceDE w:val="0"/>
-        <w:autoSpaceDN w:val="0"/>
-        <w:adjustRightInd w:val="0"/>
-        <w:spacing w:after="0" w:line="240" w:lineRule="auto"/>
-      </w:pPr>
-      <w:r>
-        <w:t>El técnico selecciona en la aplicación la opción de ver a una distancia superior.</w:t>
-      </w:r>
-    </w:p>
-    <w:p>
-      <w:pPr>
-        <w:pStyle w:val="Prrafodelista"/>
-        <w:numPr>
-          <w:ilvl w:val="0"/>
-          <w:numId w:val="38"/>
-        </w:numPr>
-        <w:autoSpaceDE w:val="0"/>
-        <w:autoSpaceDN w:val="0"/>
-        <w:adjustRightInd w:val="0"/>
-        <w:spacing w:after="0" w:line="240" w:lineRule="auto"/>
-      </w:pPr>
-      <w:r>
-        <w:t xml:space="preserve">La aplicación detecta que la geolocalización </w:t>
-      </w:r>
-      <w:r>
-        <w:t xml:space="preserve">no </w:t>
-      </w:r>
-      <w:r>
-        <w:t>está disponible</w:t>
-      </w:r>
-    </w:p>
-    <w:p>
-      <w:pPr>
-        <w:pStyle w:val="Prrafodelista"/>
-        <w:numPr>
-          <w:ilvl w:val="0"/>
-          <w:numId w:val="38"/>
-        </w:numPr>
-        <w:autoSpaceDE w:val="0"/>
-        <w:autoSpaceDN w:val="0"/>
-        <w:adjustRightInd w:val="0"/>
-        <w:spacing w:after="0" w:line="240" w:lineRule="auto"/>
-      </w:pPr>
-      <w:r>
-        <w:lastRenderedPageBreak/>
-        <w:t>Se verifica que la aplicación notifica al técnico</w:t>
-      </w:r>
-      <w:r>
-        <w:t xml:space="preserve"> con el mensaje “Ubicación no </w:t>
-      </w:r>
-      <w:r>
-        <w:t>disponible</w:t>
-      </w:r>
-      <w:r>
-        <w:t>”</w:t>
-      </w:r>
-      <w:r>
-        <w:t>.</w:t>
-      </w:r>
-    </w:p>
-    <w:p>
-      <w:pPr>
-        <w:autoSpaceDE w:val="0"/>
-        <w:autoSpaceDN w:val="0"/>
-        <w:adjustRightInd w:val="0"/>
-        <w:spacing w:after="0" w:line="240" w:lineRule="auto"/>
-      </w:pPr>
-    </w:p>
-    <w:p>
-      <w:pPr>
-        <w:autoSpaceDE w:val="0"/>
-        <w:autoSpaceDN w:val="0"/>
-        <w:adjustRightInd w:val="0"/>
-        <w:spacing w:after="0" w:line="240" w:lineRule="auto"/>
-        <w:ind w:left="708"/>
-        <w:rPr>
-          <w:rFonts w:eastAsiaTheme="minorHAnsi" w:cs="Calibri"/>
-          <w:color w:val="000000"/>
-        </w:rPr>
-      </w:pPr>
-    </w:p>
-    <w:p>
-      <w:pPr>
-        <w:autoSpaceDE w:val="0"/>
-        <w:autoSpaceDN w:val="0"/>
-        <w:adjustRightInd w:val="0"/>
         <w:spacing w:after="120" w:line="240" w:lineRule="auto"/>
         <w:rPr>
           <w:rFonts w:eastAsiaTheme="minorHAnsi" w:cs="Calibri"/>
@@ -1421,6 +736,723 @@
           <w:bCs/>
           <w:u w:val="single"/>
         </w:rPr>
+        <w:t xml:space="preserve">TODAS LAS PRUEBAS DE INTERFAZ HAN DE REALIZARSE </w:t>
+      </w:r>
+      <w:r>
+        <w:rPr>
+          <w:rFonts w:eastAsiaTheme="minorHAnsi" w:cs="Calibri"/>
+          <w:b/>
+          <w:bCs/>
+          <w:u w:val="single"/>
+        </w:rPr>
+        <w:t>SITUANDO LA UBICACIÓN DEL SIMULADOR EN LA FACULTAD DE CIENCIAS DE SANTANDER</w:t>
+      </w:r>
+    </w:p>
+    <w:p>
+      <w:pPr>
+        <w:autoSpaceDE w:val="0"/>
+        <w:autoSpaceDN w:val="0"/>
+        <w:adjustRightInd w:val="0"/>
+        <w:spacing w:after="0" w:line="240" w:lineRule="auto"/>
+      </w:pPr>
+      <w:r>
+        <w:t>Prueba 00. Éxito:</w:t>
+      </w:r>
+    </w:p>
+    <w:p>
+      <w:pPr>
+        <w:pStyle w:val="Prrafodelista"/>
+        <w:numPr>
+          <w:ilvl w:val="0"/>
+          <w:numId w:val="31"/>
+        </w:numPr>
+        <w:autoSpaceDE w:val="0"/>
+        <w:autoSpaceDN w:val="0"/>
+        <w:adjustRightInd w:val="0"/>
+        <w:spacing w:after="0" w:line="240" w:lineRule="auto"/>
+      </w:pPr>
+      <w:r>
+        <w:t>La aplicación solicita al técnico la distancia por la que desea filtrar (en Km).</w:t>
+      </w:r>
+    </w:p>
+    <w:p>
+      <w:pPr>
+        <w:pStyle w:val="Prrafodelista"/>
+        <w:numPr>
+          <w:ilvl w:val="0"/>
+          <w:numId w:val="31"/>
+        </w:numPr>
+        <w:autoSpaceDE w:val="0"/>
+        <w:autoSpaceDN w:val="0"/>
+        <w:adjustRightInd w:val="0"/>
+        <w:spacing w:after="0" w:line="240" w:lineRule="auto"/>
+      </w:pPr>
+      <w:r>
+        <w:t xml:space="preserve">El técnico introduce </w:t>
+      </w:r>
+      <w:r>
+        <w:t xml:space="preserve">5Km </w:t>
+      </w:r>
+      <w:r>
+        <w:t>en la aplicación.</w:t>
+      </w:r>
+    </w:p>
+    <w:p>
+      <w:pPr>
+        <w:pStyle w:val="Prrafodelista"/>
+        <w:numPr>
+          <w:ilvl w:val="0"/>
+          <w:numId w:val="31"/>
+        </w:numPr>
+        <w:autoSpaceDE w:val="0"/>
+        <w:autoSpaceDN w:val="0"/>
+        <w:adjustRightInd w:val="0"/>
+        <w:spacing w:after="0" w:line="240" w:lineRule="auto"/>
+      </w:pPr>
+      <w:r>
+        <w:t>La aplicación comprueba que la distancia introducida es válida.</w:t>
+      </w:r>
+    </w:p>
+    <w:p>
+      <w:pPr>
+        <w:pStyle w:val="Prrafodelista"/>
+        <w:numPr>
+          <w:ilvl w:val="0"/>
+          <w:numId w:val="31"/>
+        </w:numPr>
+        <w:autoSpaceDE w:val="0"/>
+        <w:autoSpaceDN w:val="0"/>
+        <w:adjustRightInd w:val="0"/>
+        <w:spacing w:after="0" w:line="240" w:lineRule="auto"/>
+      </w:pPr>
+      <w:r>
+        <w:t>La aplicación solicita al técnico si desea ver las estaciones a una distancia inferior o superior al límite establecido.</w:t>
+      </w:r>
+    </w:p>
+    <w:p>
+      <w:pPr>
+        <w:pStyle w:val="Prrafodelista"/>
+        <w:numPr>
+          <w:ilvl w:val="0"/>
+          <w:numId w:val="31"/>
+        </w:numPr>
+        <w:autoSpaceDE w:val="0"/>
+        <w:autoSpaceDN w:val="0"/>
+        <w:adjustRightInd w:val="0"/>
+        <w:spacing w:after="0" w:line="240" w:lineRule="auto"/>
+      </w:pPr>
+      <w:r>
+        <w:t xml:space="preserve">El técnico selecciona en la aplicación la opción </w:t>
+      </w:r>
+      <w:r>
+        <w:t>de ver</w:t>
+      </w:r>
+      <w:r>
+        <w:t xml:space="preserve"> a una distancia </w:t>
+      </w:r>
+      <w:r>
+        <w:t>superior</w:t>
+      </w:r>
+      <w:r>
+        <w:t>.</w:t>
+      </w:r>
+    </w:p>
+    <w:p>
+      <w:pPr>
+        <w:pStyle w:val="Prrafodelista"/>
+        <w:numPr>
+          <w:ilvl w:val="0"/>
+          <w:numId w:val="31"/>
+        </w:numPr>
+        <w:autoSpaceDE w:val="0"/>
+        <w:autoSpaceDN w:val="0"/>
+        <w:adjustRightInd w:val="0"/>
+        <w:spacing w:after="0" w:line="240" w:lineRule="auto"/>
+      </w:pPr>
+      <w:r>
+        <w:t>La aplicación detecta que la geolocalización está disponible</w:t>
+      </w:r>
+    </w:p>
+    <w:p>
+      <w:pPr>
+        <w:pStyle w:val="Prrafodelista"/>
+        <w:numPr>
+          <w:ilvl w:val="0"/>
+          <w:numId w:val="31"/>
+        </w:numPr>
+        <w:autoSpaceDE w:val="0"/>
+        <w:autoSpaceDN w:val="0"/>
+        <w:adjustRightInd w:val="0"/>
+        <w:spacing w:after="0" w:line="240" w:lineRule="auto"/>
+      </w:pPr>
+      <w:r>
+        <w:t>La aplicación muestra las estaciones que cumplan el requisito de filtrado, ordenadas por distancia (de menor a mayor), con su nombre y la distancia.</w:t>
+      </w:r>
+    </w:p>
+    <w:p>
+      <w:pPr>
+        <w:pStyle w:val="Prrafodelista"/>
+        <w:numPr>
+          <w:ilvl w:val="0"/>
+          <w:numId w:val="31"/>
+        </w:numPr>
+        <w:autoSpaceDE w:val="0"/>
+        <w:autoSpaceDN w:val="0"/>
+        <w:adjustRightInd w:val="0"/>
+        <w:spacing w:after="0" w:line="240" w:lineRule="auto"/>
+      </w:pPr>
+      <w:r>
+        <w:t>Se verifica que las estaciones mostradas cumplen el requisito de filtrado y que todas las que lo cumplen se muestran.</w:t>
+      </w:r>
+    </w:p>
+    <w:p>
+      <w:pPr>
+        <w:pStyle w:val="Prrafodelista"/>
+        <w:numPr>
+          <w:ilvl w:val="0"/>
+          <w:numId w:val="31"/>
+        </w:numPr>
+        <w:autoSpaceDE w:val="0"/>
+        <w:autoSpaceDN w:val="0"/>
+        <w:adjustRightInd w:val="0"/>
+        <w:spacing w:after="0" w:line="240" w:lineRule="auto"/>
+      </w:pPr>
+      <w:r>
+        <w:t>Se verifica que las estaciones mostradas están ordenadas por distancia (de menor a mayor).</w:t>
+      </w:r>
+    </w:p>
+    <w:p>
+      <w:pPr>
+        <w:pStyle w:val="Prrafodelista"/>
+        <w:numPr>
+          <w:ilvl w:val="0"/>
+          <w:numId w:val="31"/>
+        </w:numPr>
+        <w:autoSpaceDE w:val="0"/>
+        <w:autoSpaceDN w:val="0"/>
+        <w:adjustRightInd w:val="0"/>
+        <w:spacing w:after="0" w:line="240" w:lineRule="auto"/>
+      </w:pPr>
+      <w:r>
+        <w:t>Se verifica que los datos mostrados de las estaciones son correctos.</w:t>
+      </w:r>
+    </w:p>
+    <w:p>
+      <w:pPr>
+        <w:autoSpaceDE w:val="0"/>
+        <w:autoSpaceDN w:val="0"/>
+        <w:adjustRightInd w:val="0"/>
+        <w:spacing w:after="0" w:line="240" w:lineRule="auto"/>
+        <w:ind w:left="708"/>
+      </w:pPr>
+    </w:p>
+    <w:p>
+      <w:pPr>
+        <w:autoSpaceDE w:val="0"/>
+        <w:autoSpaceDN w:val="0"/>
+        <w:adjustRightInd w:val="0"/>
+        <w:spacing w:after="0" w:line="240" w:lineRule="auto"/>
+      </w:pPr>
+      <w:r>
+        <w:t>Prueba 01. No existen estaciones en el rango de filtrado:</w:t>
+      </w:r>
+    </w:p>
+    <w:p>
+      <w:pPr>
+        <w:pStyle w:val="Prrafodelista"/>
+        <w:numPr>
+          <w:ilvl w:val="0"/>
+          <w:numId w:val="24"/>
+        </w:numPr>
+        <w:autoSpaceDE w:val="0"/>
+        <w:autoSpaceDN w:val="0"/>
+        <w:adjustRightInd w:val="0"/>
+        <w:spacing w:after="0" w:line="240" w:lineRule="auto"/>
+      </w:pPr>
+      <w:r>
+        <w:t>La aplicación detecta que la geolocalización está disponible</w:t>
+      </w:r>
+    </w:p>
+    <w:p>
+      <w:pPr>
+        <w:pStyle w:val="Prrafodelista"/>
+        <w:numPr>
+          <w:ilvl w:val="0"/>
+          <w:numId w:val="24"/>
+        </w:numPr>
+        <w:autoSpaceDE w:val="0"/>
+        <w:autoSpaceDN w:val="0"/>
+        <w:adjustRightInd w:val="0"/>
+        <w:spacing w:after="0" w:line="240" w:lineRule="auto"/>
+      </w:pPr>
+      <w:r>
+        <w:t>La aplicación solicita al técnico la distancia por la que desea filtrar (en Km).</w:t>
+      </w:r>
+    </w:p>
+    <w:p>
+      <w:pPr>
+        <w:pStyle w:val="Prrafodelista"/>
+        <w:numPr>
+          <w:ilvl w:val="0"/>
+          <w:numId w:val="24"/>
+        </w:numPr>
+        <w:autoSpaceDE w:val="0"/>
+        <w:autoSpaceDN w:val="0"/>
+        <w:adjustRightInd w:val="0"/>
+        <w:spacing w:after="0" w:line="240" w:lineRule="auto"/>
+      </w:pPr>
+      <w:r>
+        <w:t xml:space="preserve">El técnico introduce en la aplicación la distancia </w:t>
+      </w:r>
+      <w:r>
+        <w:t>1km</w:t>
+      </w:r>
+      <w:r>
+        <w:t>.</w:t>
+      </w:r>
+    </w:p>
+    <w:p>
+      <w:pPr>
+        <w:pStyle w:val="Prrafodelista"/>
+        <w:numPr>
+          <w:ilvl w:val="0"/>
+          <w:numId w:val="24"/>
+        </w:numPr>
+        <w:autoSpaceDE w:val="0"/>
+        <w:autoSpaceDN w:val="0"/>
+        <w:adjustRightInd w:val="0"/>
+        <w:spacing w:after="0" w:line="240" w:lineRule="auto"/>
+      </w:pPr>
+      <w:r>
+        <w:t>La aplicación comprueba que la distancia introducida es válida.</w:t>
+      </w:r>
+    </w:p>
+    <w:p>
+      <w:pPr>
+        <w:pStyle w:val="Prrafodelista"/>
+        <w:numPr>
+          <w:ilvl w:val="0"/>
+          <w:numId w:val="24"/>
+        </w:numPr>
+        <w:autoSpaceDE w:val="0"/>
+        <w:autoSpaceDN w:val="0"/>
+        <w:adjustRightInd w:val="0"/>
+        <w:spacing w:after="0" w:line="240" w:lineRule="auto"/>
+      </w:pPr>
+      <w:r>
+        <w:t>La aplicación solicita al técnico si desea ver las estaciones a una distancia inferior o superior al límite establecido.</w:t>
+      </w:r>
+    </w:p>
+    <w:p>
+      <w:pPr>
+        <w:pStyle w:val="Prrafodelista"/>
+        <w:numPr>
+          <w:ilvl w:val="0"/>
+          <w:numId w:val="24"/>
+        </w:numPr>
+        <w:autoSpaceDE w:val="0"/>
+        <w:autoSpaceDN w:val="0"/>
+        <w:adjustRightInd w:val="0"/>
+        <w:spacing w:after="0" w:line="240" w:lineRule="auto"/>
+      </w:pPr>
+      <w:r>
+        <w:t xml:space="preserve">El técnico selecciona en la aplicación la opción </w:t>
+      </w:r>
+      <w:r>
+        <w:t>distancia inferior</w:t>
+      </w:r>
+      <w:r>
+        <w:t>.</w:t>
+      </w:r>
+    </w:p>
+    <w:p>
+      <w:pPr>
+        <w:pStyle w:val="Prrafodelista"/>
+        <w:numPr>
+          <w:ilvl w:val="0"/>
+          <w:numId w:val="24"/>
+        </w:numPr>
+        <w:autoSpaceDE w:val="0"/>
+        <w:autoSpaceDN w:val="0"/>
+        <w:adjustRightInd w:val="0"/>
+        <w:spacing w:after="0" w:line="240" w:lineRule="auto"/>
+      </w:pPr>
+      <w:r>
+        <w:t>La aplicación detecta que la geolocalización está disponible</w:t>
+      </w:r>
+    </w:p>
+    <w:p>
+      <w:pPr>
+        <w:pStyle w:val="Prrafodelista"/>
+        <w:numPr>
+          <w:ilvl w:val="0"/>
+          <w:numId w:val="24"/>
+        </w:numPr>
+        <w:autoSpaceDE w:val="0"/>
+        <w:autoSpaceDN w:val="0"/>
+        <w:adjustRightInd w:val="0"/>
+        <w:spacing w:after="0" w:line="240" w:lineRule="auto"/>
+      </w:pPr>
+      <w:r>
+        <w:t>La aplicación detecta que no hay estaciones en el rango de filtrado.</w:t>
+      </w:r>
+    </w:p>
+    <w:p>
+      <w:pPr>
+        <w:pStyle w:val="Prrafodelista"/>
+        <w:numPr>
+          <w:ilvl w:val="0"/>
+          <w:numId w:val="24"/>
+        </w:numPr>
+        <w:autoSpaceDE w:val="0"/>
+        <w:autoSpaceDN w:val="0"/>
+        <w:adjustRightInd w:val="0"/>
+        <w:spacing w:after="0" w:line="240" w:lineRule="auto"/>
+      </w:pPr>
+      <w:r>
+        <w:t xml:space="preserve">Se verifica que la aplicación notifica al técnico </w:t>
+      </w:r>
+      <w:r>
+        <w:t>con el mensaje “N</w:t>
+      </w:r>
+      <w:r>
+        <w:t>o hay estaciones en el rango deseado</w:t>
+      </w:r>
+      <w:r>
+        <w:t>”</w:t>
+      </w:r>
+      <w:r>
+        <w:t>.</w:t>
+      </w:r>
+    </w:p>
+    <w:p>
+      <w:pPr>
+        <w:autoSpaceDE w:val="0"/>
+        <w:autoSpaceDN w:val="0"/>
+        <w:adjustRightInd w:val="0"/>
+        <w:spacing w:after="0" w:line="240" w:lineRule="auto"/>
+      </w:pPr>
+    </w:p>
+    <w:p>
+      <w:pPr>
+        <w:autoSpaceDE w:val="0"/>
+        <w:autoSpaceDN w:val="0"/>
+        <w:adjustRightInd w:val="0"/>
+        <w:spacing w:after="0" w:line="240" w:lineRule="auto"/>
+      </w:pPr>
+      <w:r>
+        <w:t>Prueba 02. Distancia introducida inválida:</w:t>
+      </w:r>
+    </w:p>
+    <w:p>
+      <w:pPr>
+        <w:autoSpaceDE w:val="0"/>
+        <w:autoSpaceDN w:val="0"/>
+        <w:adjustRightInd w:val="0"/>
+        <w:spacing w:after="0" w:line="240" w:lineRule="auto"/>
+      </w:pPr>
+      <w:r>
+        <w:t>Nota: Una distancia será inválida bien si es negativa o bien si tiene decimales.</w:t>
+      </w:r>
+    </w:p>
+    <w:p>
+      <w:pPr>
+        <w:pStyle w:val="Prrafodelista"/>
+        <w:numPr>
+          <w:ilvl w:val="0"/>
+          <w:numId w:val="25"/>
+        </w:numPr>
+        <w:autoSpaceDE w:val="0"/>
+        <w:autoSpaceDN w:val="0"/>
+        <w:adjustRightInd w:val="0"/>
+        <w:spacing w:after="0" w:line="240" w:lineRule="auto"/>
+      </w:pPr>
+      <w:r>
+        <w:t>La aplicación detecta que la geolocalización está disponible</w:t>
+      </w:r>
+    </w:p>
+    <w:p>
+      <w:pPr>
+        <w:pStyle w:val="Prrafodelista"/>
+        <w:numPr>
+          <w:ilvl w:val="0"/>
+          <w:numId w:val="25"/>
+        </w:numPr>
+        <w:autoSpaceDE w:val="0"/>
+        <w:autoSpaceDN w:val="0"/>
+        <w:adjustRightInd w:val="0"/>
+        <w:spacing w:after="0" w:line="240" w:lineRule="auto"/>
+      </w:pPr>
+      <w:r>
+        <w:t>La aplicación solicita al técnico la distancia por la que desea filtrar (en Km).</w:t>
+      </w:r>
+    </w:p>
+    <w:p>
+      <w:pPr>
+        <w:pStyle w:val="Prrafodelista"/>
+        <w:numPr>
+          <w:ilvl w:val="0"/>
+          <w:numId w:val="25"/>
+        </w:numPr>
+        <w:autoSpaceDE w:val="0"/>
+        <w:autoSpaceDN w:val="0"/>
+        <w:adjustRightInd w:val="0"/>
+        <w:spacing w:after="0" w:line="240" w:lineRule="auto"/>
+      </w:pPr>
+      <w:r>
+        <w:t xml:space="preserve">El técnico intenta introducir </w:t>
+      </w:r>
+      <w:r>
+        <w:t xml:space="preserve">-3Km </w:t>
+      </w:r>
+      <w:r>
+        <w:t>en la aplicación.</w:t>
+      </w:r>
+    </w:p>
+    <w:p>
+      <w:pPr>
+        <w:pStyle w:val="Prrafodelista"/>
+        <w:numPr>
+          <w:ilvl w:val="0"/>
+          <w:numId w:val="25"/>
+        </w:numPr>
+        <w:autoSpaceDE w:val="0"/>
+        <w:autoSpaceDN w:val="0"/>
+        <w:adjustRightInd w:val="0"/>
+        <w:spacing w:after="0" w:line="240" w:lineRule="auto"/>
+      </w:pPr>
+      <w:r>
+        <w:t>La aplicación detecta que la distancia que trata de introducir el técnico no es válida.</w:t>
+      </w:r>
+    </w:p>
+    <w:p>
+      <w:pPr>
+        <w:pStyle w:val="Prrafodelista"/>
+        <w:numPr>
+          <w:ilvl w:val="0"/>
+          <w:numId w:val="25"/>
+        </w:numPr>
+        <w:autoSpaceDE w:val="0"/>
+        <w:autoSpaceDN w:val="0"/>
+        <w:adjustRightInd w:val="0"/>
+        <w:spacing w:after="0" w:line="240" w:lineRule="auto"/>
+      </w:pPr>
+      <w:r>
+        <w:t>El sistema muestra el mensaje “Distancia no v</w:t>
+      </w:r>
+      <w:r>
+        <w:t>á</w:t>
+      </w:r>
+      <w:r>
+        <w:t xml:space="preserve">lida” y no </w:t>
+      </w:r>
+      <w:r>
+        <w:t>realiza</w:t>
+      </w:r>
+      <w:r>
+        <w:t xml:space="preserve"> el filtrado</w:t>
+      </w:r>
+      <w:r>
+        <w:t>.</w:t>
+      </w:r>
+    </w:p>
+    <w:p>
+      <w:pPr>
+        <w:autoSpaceDE w:val="0"/>
+        <w:autoSpaceDN w:val="0"/>
+        <w:adjustRightInd w:val="0"/>
+        <w:spacing w:after="0" w:line="240" w:lineRule="auto"/>
+      </w:pPr>
+    </w:p>
+    <w:p>
+      <w:pPr>
+        <w:autoSpaceDE w:val="0"/>
+        <w:autoSpaceDN w:val="0"/>
+        <w:adjustRightInd w:val="0"/>
+        <w:spacing w:after="0" w:line="240" w:lineRule="auto"/>
+      </w:pPr>
+      <w:r>
+        <w:t>Prueba 0</w:t>
+      </w:r>
+      <w:r>
+        <w:t>3</w:t>
+      </w:r>
+      <w:r>
+        <w:t>. Geolocalización no disponible:</w:t>
+      </w:r>
+    </w:p>
+    <w:p>
+      <w:pPr>
+        <w:pStyle w:val="Prrafodelista"/>
+        <w:numPr>
+          <w:ilvl w:val="0"/>
+          <w:numId w:val="38"/>
+        </w:numPr>
+        <w:autoSpaceDE w:val="0"/>
+        <w:autoSpaceDN w:val="0"/>
+        <w:adjustRightInd w:val="0"/>
+        <w:spacing w:after="0" w:line="240" w:lineRule="auto"/>
+      </w:pPr>
+      <w:r>
+        <w:t>La aplicación solicita al técnico la distancia por la que desea filtrar (en Km).</w:t>
+      </w:r>
+    </w:p>
+    <w:p>
+      <w:pPr>
+        <w:pStyle w:val="Prrafodelista"/>
+        <w:numPr>
+          <w:ilvl w:val="0"/>
+          <w:numId w:val="38"/>
+        </w:numPr>
+        <w:autoSpaceDE w:val="0"/>
+        <w:autoSpaceDN w:val="0"/>
+        <w:adjustRightInd w:val="0"/>
+        <w:spacing w:after="0" w:line="240" w:lineRule="auto"/>
+      </w:pPr>
+      <w:r>
+        <w:t>El técnico introduce 5Km en la aplicación.</w:t>
+      </w:r>
+    </w:p>
+    <w:p>
+      <w:pPr>
+        <w:pStyle w:val="Prrafodelista"/>
+        <w:numPr>
+          <w:ilvl w:val="0"/>
+          <w:numId w:val="38"/>
+        </w:numPr>
+        <w:autoSpaceDE w:val="0"/>
+        <w:autoSpaceDN w:val="0"/>
+        <w:adjustRightInd w:val="0"/>
+        <w:spacing w:after="0" w:line="240" w:lineRule="auto"/>
+      </w:pPr>
+      <w:r>
+        <w:t>La aplicación comprueba que la distancia introducida es válida.</w:t>
+      </w:r>
+    </w:p>
+    <w:p>
+      <w:pPr>
+        <w:pStyle w:val="Prrafodelista"/>
+        <w:numPr>
+          <w:ilvl w:val="0"/>
+          <w:numId w:val="38"/>
+        </w:numPr>
+        <w:autoSpaceDE w:val="0"/>
+        <w:autoSpaceDN w:val="0"/>
+        <w:adjustRightInd w:val="0"/>
+        <w:spacing w:after="0" w:line="240" w:lineRule="auto"/>
+      </w:pPr>
+      <w:r>
+        <w:t>La aplicación solicita al técnico si desea ver las estaciones a una distancia inferior o superior al límite establecido.</w:t>
+      </w:r>
+    </w:p>
+    <w:p>
+      <w:pPr>
+        <w:pStyle w:val="Prrafodelista"/>
+        <w:numPr>
+          <w:ilvl w:val="0"/>
+          <w:numId w:val="38"/>
+        </w:numPr>
+        <w:autoSpaceDE w:val="0"/>
+        <w:autoSpaceDN w:val="0"/>
+        <w:adjustRightInd w:val="0"/>
+        <w:spacing w:after="0" w:line="240" w:lineRule="auto"/>
+      </w:pPr>
+      <w:r>
+        <w:lastRenderedPageBreak/>
+        <w:t>El técnico selecciona en la aplicación la opción de ver a una distancia superior.</w:t>
+      </w:r>
+    </w:p>
+    <w:p>
+      <w:pPr>
+        <w:pStyle w:val="Prrafodelista"/>
+        <w:numPr>
+          <w:ilvl w:val="0"/>
+          <w:numId w:val="38"/>
+        </w:numPr>
+        <w:autoSpaceDE w:val="0"/>
+        <w:autoSpaceDN w:val="0"/>
+        <w:adjustRightInd w:val="0"/>
+        <w:spacing w:after="0" w:line="240" w:lineRule="auto"/>
+      </w:pPr>
+      <w:r>
+        <w:t xml:space="preserve">La aplicación detecta que la geolocalización </w:t>
+      </w:r>
+      <w:r>
+        <w:t xml:space="preserve">no </w:t>
+      </w:r>
+      <w:r>
+        <w:t>está disponible</w:t>
+      </w:r>
+    </w:p>
+    <w:p>
+      <w:pPr>
+        <w:pStyle w:val="Prrafodelista"/>
+        <w:numPr>
+          <w:ilvl w:val="0"/>
+          <w:numId w:val="38"/>
+        </w:numPr>
+        <w:autoSpaceDE w:val="0"/>
+        <w:autoSpaceDN w:val="0"/>
+        <w:adjustRightInd w:val="0"/>
+        <w:spacing w:after="0" w:line="240" w:lineRule="auto"/>
+      </w:pPr>
+      <w:r>
+        <w:t>Se verifica que la aplicación notifica al técnico</w:t>
+      </w:r>
+      <w:r>
+        <w:t xml:space="preserve"> con el mensaje “Ubicación no </w:t>
+      </w:r>
+      <w:r>
+        <w:t>disponible</w:t>
+      </w:r>
+      <w:r>
+        <w:t>”</w:t>
+      </w:r>
+      <w:r>
+        <w:t>.</w:t>
+      </w:r>
+    </w:p>
+    <w:p>
+      <w:pPr>
+        <w:autoSpaceDE w:val="0"/>
+        <w:autoSpaceDN w:val="0"/>
+        <w:adjustRightInd w:val="0"/>
+        <w:spacing w:after="0" w:line="240" w:lineRule="auto"/>
+      </w:pPr>
+    </w:p>
+    <w:p>
+      <w:pPr>
+        <w:autoSpaceDE w:val="0"/>
+        <w:autoSpaceDN w:val="0"/>
+        <w:adjustRightInd w:val="0"/>
+        <w:spacing w:after="0" w:line="240" w:lineRule="auto"/>
+        <w:ind w:left="708"/>
+        <w:rPr>
+          <w:rFonts w:eastAsiaTheme="minorHAnsi" w:cs="Calibri"/>
+          <w:color w:val="000000"/>
+        </w:rPr>
+      </w:pPr>
+    </w:p>
+    <w:p>
+      <w:pPr>
+        <w:autoSpaceDE w:val="0"/>
+        <w:autoSpaceDN w:val="0"/>
+        <w:adjustRightInd w:val="0"/>
+        <w:spacing w:after="120" w:line="240" w:lineRule="auto"/>
+        <w:rPr>
+          <w:rFonts w:eastAsiaTheme="minorHAnsi" w:cs="Calibri"/>
+          <w:b/>
+          <w:bCs/>
+          <w:u w:val="single"/>
+        </w:rPr>
+      </w:pPr>
+      <w:r>
+        <w:rPr>
+          <w:rFonts w:eastAsiaTheme="minorHAnsi" w:cs="Calibri"/>
+          <w:b/>
+          <w:bCs/>
+          <w:u w:val="single"/>
+        </w:rPr>
         <w:t xml:space="preserve">METODOS SUSCEPTIBLES DE </w:t>
       </w:r>
       <w:r>
@@ -1456,32 +1488,44 @@
         </w:rPr>
       </w:pPr>
       <w:r>
-        <w:t>Método</w:t>
+        <w:t xml:space="preserve">En este caso solo ha creado un </w:t>
+      </w:r>
+      <w:r>
+        <w:t>método susceptible a pruebas unitarias o de integración:</w:t>
       </w:r>
       <w:r>
         <w:t xml:space="preserve"> </w:t>
       </w:r>
-      <w:proofErr w:type="spellStart"/>
-      <w:r>
-        <w:t>aplicarFiltro</w:t>
-      </w:r>
-      <w:proofErr w:type="spellEnd"/>
-      <w:r>
-        <w:t xml:space="preserve">, </w:t>
-      </w:r>
-      <w:proofErr w:type="spellStart"/>
-      <w:r>
-        <w:t>Fitrar</w:t>
-      </w:r>
-      <w:proofErr w:type="spellEnd"/>
-      <w:r>
-        <w:t xml:space="preserve">, </w:t>
-      </w:r>
-      <w:proofErr w:type="spellStart"/>
-      <w:r>
-        <w:t>OrdenarPorDistancia</w:t>
-      </w:r>
-      <w:proofErr w:type="spellEnd"/>
+      <w:r>
+        <w:t>onFilterClicked(String distanceText, DistanceFilter filter)</w:t>
+      </w:r>
+      <w:r>
+        <w:t>, que es el encragado de filtrar y ordenar las estaciones</w:t>
+      </w:r>
+      <w:r>
+        <w:t xml:space="preserve"> ya que los otros métodos creados están en la vista y se tratan de </w:t>
+      </w:r>
+      <w:r>
+        <w:t>onClickFilterMoreThanDistance()</w:t>
+      </w:r>
+      <w:r>
+        <w:t xml:space="preserve"> y </w:t>
+      </w:r>
+      <w:r>
+        <w:t>onClickFilter</w:t>
+      </w:r>
+      <w:r>
+        <w:t>Less</w:t>
+      </w:r>
+      <w:r>
+        <w:t>ThanDistance()</w:t>
+      </w:r>
+      <w:r>
+        <w:t xml:space="preserve"> cuya única función es llamar al onFilterClicked con los parámetros correspondientes</w:t>
+      </w:r>
+      <w:r>
+        <w:t>.</w:t>
+      </w:r>
     </w:p>
     <w:p>
       <w:pPr>
@@ -1505,20 +1549,6 @@
           <w:u w:val="single"/>
         </w:rPr>
         <w:t>s</w:t>
-      </w:r>
-    </w:p>
-    <w:p>
-      <w:pPr>
-        <w:pStyle w:val="Prrafodelista"/>
-        <w:spacing w:after="120"/>
-        <w:ind w:left="0"/>
-        <w:jc w:val="both"/>
-      </w:pPr>
-      <w:r>
-        <w:t xml:space="preserve">Se aplica prueba de métodos, siendo los casos de prueba definidos para cada método los </w:t>
-      </w:r>
-      <w:r>
-        <w:t>que se exponen a continuación.</w:t>
       </w:r>
     </w:p>
     <w:p>
@@ -1536,13 +1566,11 @@
         <w:t>Método</w:t>
       </w:r>
       <w:r>
-        <w:t xml:space="preserve"> de la clase </w:t>
-      </w:r>
-      <w:proofErr w:type="spellStart"/>
-      <w:r>
-        <w:t>DetailsView</w:t>
-      </w:r>
-      <w:proofErr w:type="spellEnd"/>
+        <w:t xml:space="preserve"> de la clase</w:t>
+      </w:r>
+      <w:r>
+        <w:t xml:space="preserve"> RedDetailsPresenter</w:t>
+      </w:r>
       <w:r>
         <w:t xml:space="preserve"> </w:t>
       </w:r>
@@ -1555,9 +1583,9 @@
         <w:tblLook w:val="04A0" w:firstRow="1" w:lastRow="0" w:firstColumn="1" w:lastColumn="0" w:noHBand="0" w:noVBand="1"/>
       </w:tblPr>
       <w:tblGrid>
-        <w:gridCol w:w="1499"/>
-        <w:gridCol w:w="2465"/>
-        <w:gridCol w:w="5529"/>
+        <w:gridCol w:w="2405"/>
+        <w:gridCol w:w="2268"/>
+        <w:gridCol w:w="4820"/>
       </w:tblGrid>
       <w:tr>
         <w:trPr>
@@ -1565,7 +1593,7 @@
         </w:trPr>
         <w:tc>
           <w:tcPr>
-            <w:tcW w:w="1499" w:type="dxa"/>
+            <w:tcW w:w="2405" w:type="dxa"/>
           </w:tcPr>
           <w:p>
             <w:pPr>
@@ -1580,7 +1608,7 @@
         </w:tc>
         <w:tc>
           <w:tcPr>
-            <w:tcW w:w="2465" w:type="dxa"/>
+            <w:tcW w:w="2268" w:type="dxa"/>
           </w:tcPr>
           <w:p>
             <w:pPr>
@@ -1595,7 +1623,7 @@
         </w:tc>
         <w:tc>
           <w:tcPr>
-            <w:tcW w:w="5529" w:type="dxa"/>
+            <w:tcW w:w="4820" w:type="dxa"/>
           </w:tcPr>
           <w:p>
             <w:pPr>
@@ -1615,7 +1643,7 @@
         </w:trPr>
         <w:tc>
           <w:tcPr>
-            <w:tcW w:w="1499" w:type="dxa"/>
+            <w:tcW w:w="2405" w:type="dxa"/>
           </w:tcPr>
           <w:p>
             <w:pPr>
@@ -1626,36 +1654,20 @@
             <w:r>
               <w:t>PU-01</w:t>
             </w:r>
-          </w:p>
-        </w:tc>
-        <w:tc>
-          <w:tcPr>
-            <w:tcW w:w="2465" w:type="dxa"/>
-          </w:tcPr>
-          <w:p>
-            <w:r>
-              <w:t xml:space="preserve">Se hace </w:t>
-            </w:r>
-            <w:proofErr w:type="spellStart"/>
-            <w:r>
-              <w:t>click</w:t>
-            </w:r>
-            <w:proofErr w:type="spellEnd"/>
             <w:r>
               <w:t xml:space="preserve"> </w:t>
             </w:r>
-            <w:proofErr w:type="spellStart"/>
-            <w:r>
-              <w:t>Bicing</w:t>
-            </w:r>
-            <w:proofErr w:type="spellEnd"/>
-          </w:p>
-          <w:p>
             <w:r>
               <w:t>(</w:t>
             </w:r>
             <w:r>
-              <w:t>Red Valida con Datos</w:t>
+              <w:t>R</w:t>
+            </w:r>
+            <w:r>
+              <w:t xml:space="preserve">ango </w:t>
+            </w:r>
+            <w:r>
+              <w:t>superior seleccionado</w:t>
             </w:r>
             <w:r>
               <w:t>)</w:t>
@@ -1664,223 +1676,27 @@
         </w:tc>
         <w:tc>
           <w:tcPr>
-            <w:tcW w:w="5529" w:type="dxa"/>
+            <w:tcW w:w="2268" w:type="dxa"/>
           </w:tcPr>
           <w:p>
             <w:r>
-              <w:t>(Nombre)</w:t>
-            </w:r>
-            <w:proofErr w:type="spellStart"/>
-            <w:r>
-              <w:t>Bicing</w:t>
-            </w:r>
-            <w:proofErr w:type="spellEnd"/>
-            <w:r>
-              <w:t>,</w:t>
+              <w:t>1</w:t>
             </w:r>
             <w:r>
-              <w:t xml:space="preserve"> </w:t>
-            </w:r>
-          </w:p>
-          <w:p>
-            <w:r>
-              <w:t>(Ciudad)Barcelona</w:t>
+              <w:t>Km y</w:t>
             </w:r>
             <w:r>
-              <w:t>,</w:t>
-            </w:r>
-          </w:p>
-          <w:p>
-            <w:r>
-              <w:t>(</w:t>
-            </w:r>
-            <w:proofErr w:type="spellStart"/>
-            <w:r>
-              <w:t>ebikes</w:t>
-            </w:r>
-            <w:proofErr w:type="spellEnd"/>
-            <w:r>
-              <w:t xml:space="preserve">) </w:t>
-            </w:r>
-            <w:r>
-              <w:t>true</w:t>
-            </w:r>
-            <w:r>
-              <w:t xml:space="preserve">, </w:t>
-            </w:r>
-          </w:p>
-          <w:p>
-            <w:r>
-              <w:t>(</w:t>
-            </w:r>
-            <w:proofErr w:type="spellStart"/>
-            <w:r>
-              <w:t>NºCompañias</w:t>
-            </w:r>
-            <w:proofErr w:type="spellEnd"/>
-            <w:r>
-              <w:t>) 3</w:t>
-            </w:r>
-            <w:r>
-              <w:t>,</w:t>
-            </w:r>
-          </w:p>
-          <w:p>
-            <w:r>
-              <w:t>(</w:t>
-            </w:r>
-            <w:proofErr w:type="spellStart"/>
-            <w:r>
-              <w:t>Compañias</w:t>
-            </w:r>
-            <w:proofErr w:type="spellEnd"/>
-            <w:r>
-              <w:t>) {</w:t>
-            </w:r>
-            <w:r>
-              <w:t xml:space="preserve">“Barcelona de </w:t>
-            </w:r>
-            <w:proofErr w:type="spellStart"/>
-            <w:r>
-              <w:t>Serveis</w:t>
-            </w:r>
-            <w:proofErr w:type="spellEnd"/>
-            <w:r>
-              <w:t xml:space="preserve"> </w:t>
-            </w:r>
-            <w:proofErr w:type="spellStart"/>
-            <w:proofErr w:type="gramStart"/>
-            <w:r>
-              <w:t>Municipals,S.A</w:t>
-            </w:r>
-            <w:proofErr w:type="spellEnd"/>
-            <w:r>
-              <w:t>.</w:t>
-            </w:r>
-            <w:proofErr w:type="gramEnd"/>
-            <w:r>
-              <w:t>(BSM)”,</w:t>
-            </w:r>
-          </w:p>
-          <w:p>
-            <w:r>
-              <w:t>“CESPA”, “PBSC”</w:t>
-            </w:r>
-            <w:r>
-              <w:t>}</w:t>
-            </w:r>
-          </w:p>
-        </w:tc>
-      </w:tr>
-      <w:tr>
-        <w:trPr>
-          <w:jc w:val="center"/>
-        </w:trPr>
-        <w:tc>
-          <w:tcPr>
-            <w:tcW w:w="1499" w:type="dxa"/>
-          </w:tcPr>
-          <w:p>
-            <w:pPr>
-              <w:pStyle w:val="Prrafodelista"/>
-              <w:ind w:left="0"/>
-              <w:jc w:val="both"/>
-            </w:pPr>
-            <w:r>
-              <w:t>PU-02</w:t>
+              <w:t xml:space="preserve"> MORE_THAN</w:t>
             </w:r>
           </w:p>
         </w:tc>
         <w:tc>
           <w:tcPr>
-            <w:tcW w:w="2465" w:type="dxa"/>
+            <w:tcW w:w="4820" w:type="dxa"/>
           </w:tcPr>
           <w:p>
             <w:r>
-              <w:t xml:space="preserve">Se hace </w:t>
-            </w:r>
-            <w:proofErr w:type="spellStart"/>
-            <w:r>
-              <w:t>click</w:t>
-            </w:r>
-            <w:proofErr w:type="spellEnd"/>
-            <w:r>
-              <w:t xml:space="preserve"> en </w:t>
-            </w:r>
-            <w:proofErr w:type="spellStart"/>
-            <w:r>
-              <w:t>TUeBICI</w:t>
-            </w:r>
-            <w:proofErr w:type="spellEnd"/>
-          </w:p>
-          <w:p>
-            <w:r>
-              <w:t>(</w:t>
-            </w:r>
-            <w:r>
-              <w:t xml:space="preserve">Red sin </w:t>
-            </w:r>
-            <w:r>
-              <w:t>información detallada</w:t>
-            </w:r>
-            <w:r>
-              <w:t>)</w:t>
-            </w:r>
-          </w:p>
-        </w:tc>
-        <w:tc>
-          <w:tcPr>
-            <w:tcW w:w="5529" w:type="dxa"/>
-          </w:tcPr>
-          <w:p>
-            <w:r>
-              <w:t>(Nombre)</w:t>
-            </w:r>
-            <w:proofErr w:type="spellStart"/>
-            <w:r>
-              <w:t>TUeBICI</w:t>
-            </w:r>
-            <w:proofErr w:type="spellEnd"/>
-            <w:r>
-              <w:t>,</w:t>
-            </w:r>
-            <w:r>
-              <w:t xml:space="preserve"> </w:t>
-            </w:r>
-          </w:p>
-          <w:p>
-            <w:r>
-              <w:t>(Ciudad)</w:t>
-            </w:r>
-            <w:r>
-              <w:t>Santander</w:t>
-            </w:r>
-            <w:r>
-              <w:t xml:space="preserve">, </w:t>
-            </w:r>
-          </w:p>
-          <w:p>
-            <w:r>
-              <w:t xml:space="preserve">El resto de </w:t>
-            </w:r>
-            <w:proofErr w:type="gramStart"/>
-            <w:r>
-              <w:t>cam</w:t>
-            </w:r>
-            <w:r>
-              <w:t>pos</w:t>
-            </w:r>
-            <w:proofErr w:type="gramEnd"/>
-            <w:r>
-              <w:t xml:space="preserve"> se muestra un mensaje de “</w:t>
-            </w:r>
-            <w:proofErr w:type="spellStart"/>
-            <w:r>
-              <w:t>noData</w:t>
-            </w:r>
-            <w:proofErr w:type="spellEnd"/>
-            <w:r>
-              <w:t>”</w:t>
+              <w:t>Lista Ordenada y filtrada:</w:t>
             </w:r>
           </w:p>
           <w:p/>
@@ -1892,7 +1708,7 @@
         </w:trPr>
         <w:tc>
           <w:tcPr>
-            <w:tcW w:w="1499" w:type="dxa"/>
+            <w:tcW w:w="2405" w:type="dxa"/>
           </w:tcPr>
           <w:p>
             <w:pPr>
@@ -1901,49 +1717,111 @@
               <w:jc w:val="both"/>
             </w:pPr>
             <w:r>
-              <w:t>PU-03</w:t>
+              <w:t>PU-0</w:t>
+            </w:r>
+            <w:r>
+              <w:t>2</w:t>
+            </w:r>
+            <w:r>
+              <w:t xml:space="preserve"> (</w:t>
+            </w:r>
+            <w:r>
+              <w:t>R</w:t>
+            </w:r>
+            <w:r>
+              <w:t>ango</w:t>
+            </w:r>
+            <w:r>
+              <w:t xml:space="preserve"> inferior</w:t>
+            </w:r>
+            <w:r>
+              <w:t xml:space="preserve"> seleccionado)</w:t>
             </w:r>
           </w:p>
         </w:tc>
         <w:tc>
           <w:tcPr>
-            <w:tcW w:w="2465" w:type="dxa"/>
+            <w:tcW w:w="2268" w:type="dxa"/>
           </w:tcPr>
           <w:p>
             <w:r>
-              <w:t xml:space="preserve">Se hace </w:t>
+              <w:t xml:space="preserve">5Km y </w:t>
             </w:r>
-            <w:proofErr w:type="spellStart"/>
             <w:r>
-              <w:t>click</w:t>
+              <w:t>LESS</w:t>
             </w:r>
-            <w:proofErr w:type="spellEnd"/>
             <w:r>
-              <w:t xml:space="preserve"> en cualquiera</w:t>
-            </w:r>
-          </w:p>
-          <w:p>
-            <w:r>
-              <w:t>(BBDD no accesible)</w:t>
+              <w:t>_THAN</w:t>
             </w:r>
           </w:p>
         </w:tc>
         <w:tc>
           <w:tcPr>
-            <w:tcW w:w="5529" w:type="dxa"/>
+            <w:tcW w:w="4820" w:type="dxa"/>
           </w:tcPr>
           <w:p>
             <w:r>
-              <w:t xml:space="preserve">Se muestra un mensaje de error al </w:t>
+              <w:t>Lista</w:t>
             </w:r>
             <w:r>
-              <w:t xml:space="preserve">cargar la </w:t>
+              <w:t xml:space="preserve"> Ordenada y filtrada:</w:t>
             </w:r>
-            <w:proofErr w:type="spellStart"/>
+          </w:p>
+          <w:p/>
+        </w:tc>
+      </w:tr>
+      <w:tr>
+        <w:trPr>
+          <w:jc w:val="center"/>
+        </w:trPr>
+        <w:tc>
+          <w:tcPr>
+            <w:tcW w:w="2405" w:type="dxa"/>
+          </w:tcPr>
+          <w:p>
+            <w:pPr>
+              <w:pStyle w:val="Prrafodelista"/>
+              <w:ind w:left="0"/>
+              <w:jc w:val="both"/>
+            </w:pPr>
             <w:r>
-              <w:t>network</w:t>
+              <w:t>PU-0</w:t>
             </w:r>
-            <w:proofErr w:type="spellEnd"/>
+            <w:r>
+              <w:t>3</w:t>
+            </w:r>
+            <w:r>
+              <w:t xml:space="preserve"> (Distancia invalida)</w:t>
+            </w:r>
+          </w:p>
+        </w:tc>
+        <w:tc>
+          <w:tcPr>
+            <w:tcW w:w="2268" w:type="dxa"/>
+          </w:tcPr>
+          <w:p>
+            <w:r>
+              <w:t>-10Km y MORE_THAN</w:t>
+            </w:r>
+          </w:p>
+        </w:tc>
+        <w:tc>
+          <w:tcPr>
+            <w:tcW w:w="4820" w:type="dxa"/>
+          </w:tcPr>
+          <w:p>
+            <w:r>
+              <w:t>Mensaje de Error: “</w:t>
+            </w:r>
+            <w:r>
+              <w:t>Invalid distance</w:t>
+            </w:r>
+            <w:r>
+              <w:t>, not decimals or negatives allowed</w:t>
+            </w:r>
+            <w:r>
+              <w:t>”</w:t>
+            </w:r>
           </w:p>
         </w:tc>
       </w:tr>
@@ -1953,7 +1831,7 @@
         </w:trPr>
         <w:tc>
           <w:tcPr>
-            <w:tcW w:w="1499" w:type="dxa"/>
+            <w:tcW w:w="2405" w:type="dxa"/>
           </w:tcPr>
           <w:p>
             <w:pPr>
@@ -1962,57 +1840,19 @@
               <w:jc w:val="both"/>
             </w:pPr>
             <w:r>
-              <w:t>PU-04</w:t>
-            </w:r>
-          </w:p>
-        </w:tc>
-        <w:tc>
-          <w:tcPr>
-            <w:tcW w:w="2465" w:type="dxa"/>
-          </w:tcPr>
-          <w:p>
-            <w:r>
-              <w:t xml:space="preserve">Se </w:t>
+              <w:t>PU-0</w:t>
             </w:r>
             <w:r>
-              <w:t xml:space="preserve">hace </w:t>
-            </w:r>
-            <w:proofErr w:type="spellStart"/>
-            <w:r>
-              <w:t>click</w:t>
-            </w:r>
-            <w:proofErr w:type="spellEnd"/>
-            <w:r>
-              <w:t xml:space="preserve"> en </w:t>
-            </w:r>
-            <w:proofErr w:type="spellStart"/>
-            <w:r>
-              <w:t>BiciMAD</w:t>
-            </w:r>
-            <w:proofErr w:type="spellEnd"/>
-          </w:p>
-          <w:p>
-            <w:r>
-              <w:t xml:space="preserve">(Datos </w:t>
-            </w:r>
-            <w:proofErr w:type="spellStart"/>
-            <w:r>
-              <w:t>Incosistentes</w:t>
-            </w:r>
-            <w:proofErr w:type="spellEnd"/>
-            <w:r>
-              <w:t>,</w:t>
+              <w:t>4</w:t>
             </w:r>
             <w:r>
               <w:t xml:space="preserve"> </w:t>
             </w:r>
-            <w:proofErr w:type="spellStart"/>
             <w:r>
-              <w:t>ebikes</w:t>
+              <w:t>(</w:t>
             </w:r>
-            <w:proofErr w:type="spellEnd"/>
             <w:r>
-              <w:t xml:space="preserve"> no es booleano</w:t>
+              <w:t>Ubicación desactivada</w:t>
             </w:r>
             <w:r>
               <w:t>)</w:t>
@@ -2021,32 +1861,118 @@
         </w:tc>
         <w:tc>
           <w:tcPr>
-            <w:tcW w:w="5529" w:type="dxa"/>
+            <w:tcW w:w="2268" w:type="dxa"/>
           </w:tcPr>
           <w:p>
             <w:r>
-              <w:t xml:space="preserve">Los campos se muestran </w:t>
+              <w:t>20</w:t>
             </w:r>
             <w:r>
-              <w:t>correctos,</w:t>
+              <w:t xml:space="preserve">Km y </w:t>
             </w:r>
             <w:r>
-              <w:t xml:space="preserve"> pero en el lugar de lo</w:t>
+              <w:t>MORE</w:t>
             </w:r>
             <w:r>
-              <w:t xml:space="preserve">s datos </w:t>
+              <w:t>_THAN</w:t>
+            </w:r>
+          </w:p>
+        </w:tc>
+        <w:tc>
+          <w:tcPr>
+            <w:tcW w:w="4820" w:type="dxa"/>
+          </w:tcPr>
+          <w:p>
+            <w:r>
+              <w:t>Mensaje de Error: “</w:t>
             </w:r>
             <w:r>
-              <w:t>inconsistentes</w:t>
+              <w:t xml:space="preserve">Location </w:t>
             </w:r>
             <w:r>
-              <w:t xml:space="preserve"> se muestra “</w:t>
+              <w:t>is</w:t>
             </w:r>
-            <w:proofErr w:type="gramStart"/>
             <w:r>
-              <w:t>-“</w:t>
+              <w:t xml:space="preserve"> not enable</w:t>
             </w:r>
-            <w:proofErr w:type="gramEnd"/>
+            <w:r>
+              <w:t>”</w:t>
+            </w:r>
+          </w:p>
+        </w:tc>
+      </w:tr>
+      <w:tr>
+        <w:trPr>
+          <w:jc w:val="center"/>
+        </w:trPr>
+        <w:tc>
+          <w:tcPr>
+            <w:tcW w:w="2405" w:type="dxa"/>
+          </w:tcPr>
+          <w:p>
+            <w:pPr>
+              <w:pStyle w:val="Prrafodelista"/>
+              <w:ind w:left="0"/>
+              <w:jc w:val="both"/>
+            </w:pPr>
+            <w:r>
+              <w:t>PU-</w:t>
+            </w:r>
+            <w:r>
+              <w:t>05 (</w:t>
+            </w:r>
+            <w:r>
+              <w:t>Sin estaciones en rango</w:t>
+            </w:r>
+            <w:r>
+              <w:t>)</w:t>
+            </w:r>
+          </w:p>
+        </w:tc>
+        <w:tc>
+          <w:tcPr>
+            <w:tcW w:w="2268" w:type="dxa"/>
+          </w:tcPr>
+          <w:p>
+            <w:r>
+              <w:t>1Km y LESS_THAN</w:t>
+            </w:r>
+          </w:p>
+        </w:tc>
+        <w:tc>
+          <w:tcPr>
+            <w:tcW w:w="4820" w:type="dxa"/>
+          </w:tcPr>
+          <w:p>
+            <w:pPr>
+              <w:rPr>
+                <w:lang w:val="en-US"/>
+              </w:rPr>
+            </w:pPr>
+            <w:r>
+              <w:rPr>
+                <w:lang w:val="en-US"/>
+              </w:rPr>
+              <w:t>Mensaje de Error</w:t>
+            </w:r>
+            <w:r>
+              <w:rPr>
+                <w:lang w:val="en-US"/>
+              </w:rPr>
+              <w:t>: “</w:t>
+            </w:r>
+            <w:r>
+              <w:rPr>
+                <w:lang w:val="en-US"/>
+              </w:rPr>
+              <w:t>There are no stations within the desired range</w:t>
+            </w:r>
+            <w:r>
+              <w:rPr>
+                <w:lang w:val="en-US"/>
+              </w:rPr>
+              <w:t>”</w:t>
+            </w:r>
           </w:p>
         </w:tc>
       </w:tr>
@@ -2055,12 +1981,18 @@
       <w:pPr>
         <w:spacing w:after="120"/>
         <w:jc w:val="both"/>
+        <w:rPr>
+          <w:lang w:val="en-US"/>
+        </w:rPr>
       </w:pPr>
     </w:p>
     <w:p>
       <w:pPr>
         <w:spacing w:after="120"/>
         <w:jc w:val="both"/>
+        <w:rPr>
+          <w:lang w:val="en-US"/>
+        </w:rPr>
       </w:pPr>
     </w:p>
     <w:p>
@@ -2289,15 +2221,7 @@
       </w:pBdr>
     </w:pPr>
     <w:r>
-      <w:t xml:space="preserve">Estructura de Datos y Algoritmos </w:t>
-    </w:r>
-    <w:proofErr w:type="gramStart"/>
-    <w:r>
-      <w:t>–  Práctica</w:t>
-    </w:r>
-    <w:proofErr w:type="gramEnd"/>
-    <w:r>
-      <w:t xml:space="preserve"> 3</w:t>
+      <w:t>Estructura de Datos y Algoritmos –  Práctica 3</w:t>
     </w:r>
   </w:p>
 </w:hdr>
@@ -2426,13 +2350,8 @@
           <w:pPr>
             <w:spacing w:after="0" w:line="240" w:lineRule="auto"/>
           </w:pPr>
-          <w:proofErr w:type="gramStart"/>
           <w:r>
-            <w:t>4º  Grado</w:t>
-          </w:r>
-          <w:proofErr w:type="gramEnd"/>
-          <w:r>
-            <w:t xml:space="preserve"> en Ing. Informática</w:t>
+            <w:t>4º  Grado en Ing. Informática</w:t>
           </w:r>
         </w:p>
         <w:p>
@@ -6333,7 +6252,7 @@
   <w:style w:type="paragraph" w:default="1" w:styleId="Normal">
     <w:name w:val="Normal"/>
     <w:qFormat/>
-    <w:rsid w:val="001150C7"/>
+    <w:rsid w:val="009E3A50"/>
     <w:rPr>
       <w:rFonts w:ascii="Calibri" w:eastAsia="Calibri" w:hAnsi="Calibri" w:cs="Times New Roman"/>
     </w:rPr>

</xml_diff>

<commit_message>
Se han completado los tests unitarios
</commit_message>
<xml_diff>
--- a/Docs/Test Plans/US532227-FiltrarEstacionesPorDistancia-TestPlan.docx
+++ b/Docs/Test Plans/US532227-FiltrarEstacionesPorDistancia-TestPlan.docx
@@ -1496,21 +1496,75 @@
       <w:r>
         <w:t xml:space="preserve"> </w:t>
       </w:r>
-      <w:r>
-        <w:t>onFilterClicked(String distanceText, DistanceFilter filter)</w:t>
-      </w:r>
-      <w:r>
-        <w:t>, que es el encragado de filtrar y ordenar las estaciones</w:t>
+      <w:proofErr w:type="spellStart"/>
+      <w:proofErr w:type="gramStart"/>
+      <w:r>
+        <w:t>onFilterClicked</w:t>
+      </w:r>
+      <w:proofErr w:type="spellEnd"/>
+      <w:r>
+        <w:t>(</w:t>
+      </w:r>
+      <w:proofErr w:type="gramEnd"/>
+      <w:r>
+        <w:t xml:space="preserve">String </w:t>
+      </w:r>
+      <w:proofErr w:type="spellStart"/>
+      <w:r>
+        <w:t>distanceText</w:t>
+      </w:r>
+      <w:proofErr w:type="spellEnd"/>
+      <w:r>
+        <w:t xml:space="preserve">, </w:t>
+      </w:r>
+      <w:proofErr w:type="spellStart"/>
+      <w:r>
+        <w:t>DistanceFilter</w:t>
+      </w:r>
+      <w:proofErr w:type="spellEnd"/>
+      <w:r>
+        <w:t xml:space="preserve"> </w:t>
+      </w:r>
+      <w:proofErr w:type="spellStart"/>
+      <w:r>
+        <w:t>filter</w:t>
+      </w:r>
+      <w:proofErr w:type="spellEnd"/>
+      <w:r>
+        <w:t>)</w:t>
+      </w:r>
+      <w:r>
+        <w:t xml:space="preserve">, que es el </w:t>
+      </w:r>
+      <w:proofErr w:type="spellStart"/>
+      <w:r>
+        <w:t>encragado</w:t>
+      </w:r>
+      <w:proofErr w:type="spellEnd"/>
+      <w:r>
+        <w:t xml:space="preserve"> de filtrar y ordenar las estaciones</w:t>
       </w:r>
       <w:r>
         <w:t xml:space="preserve"> ya que los otros métodos creados están en la vista y se tratan de </w:t>
       </w:r>
-      <w:r>
-        <w:t>onClickFilterMoreThanDistance()</w:t>
+      <w:proofErr w:type="spellStart"/>
+      <w:proofErr w:type="gramStart"/>
+      <w:r>
+        <w:t>onClickFilterMoreThanDistance</w:t>
+      </w:r>
+      <w:proofErr w:type="spellEnd"/>
+      <w:r>
+        <w:t>(</w:t>
+      </w:r>
+      <w:proofErr w:type="gramEnd"/>
+      <w:r>
+        <w:t>)</w:t>
       </w:r>
       <w:r>
         <w:t xml:space="preserve"> y </w:t>
       </w:r>
+      <w:proofErr w:type="spellStart"/>
+      <w:proofErr w:type="gramStart"/>
       <w:r>
         <w:t>onClickFilter</w:t>
       </w:r>
@@ -1518,10 +1572,26 @@
         <w:t>Less</w:t>
       </w:r>
       <w:r>
-        <w:t>ThanDistance()</w:t>
-      </w:r>
-      <w:r>
-        <w:t xml:space="preserve"> cuya única función es llamar al onFilterClicked con los parámetros correspondientes</w:t>
+        <w:t>ThanDistance</w:t>
+      </w:r>
+      <w:proofErr w:type="spellEnd"/>
+      <w:r>
+        <w:t>(</w:t>
+      </w:r>
+      <w:proofErr w:type="gramEnd"/>
+      <w:r>
+        <w:t>)</w:t>
+      </w:r>
+      <w:r>
+        <w:t xml:space="preserve"> cuya única función es llamar al </w:t>
+      </w:r>
+      <w:proofErr w:type="spellStart"/>
+      <w:r>
+        <w:t>onFilterClicked</w:t>
+      </w:r>
+      <w:proofErr w:type="spellEnd"/>
+      <w:r>
+        <w:t xml:space="preserve"> con los parámetros correspondientes</w:t>
       </w:r>
       <w:r>
         <w:t>.</w:t>
@@ -1569,8 +1639,13 @@
         <w:t xml:space="preserve"> de la clase</w:t>
       </w:r>
       <w:r>
-        <w:t xml:space="preserve"> RedDetailsPresenter</w:t>
-      </w:r>
+        <w:t xml:space="preserve"> </w:t>
+      </w:r>
+      <w:proofErr w:type="spellStart"/>
+      <w:r>
+        <w:t>RedDetailsPresenter</w:t>
+      </w:r>
+      <w:proofErr w:type="spellEnd"/>
       <w:r>
         <w:t xml:space="preserve"> </w:t>
       </w:r>
@@ -1745,13 +1820,7 @@
           </w:tcPr>
           <w:p>
             <w:r>
-              <w:t xml:space="preserve">5Km y </w:t>
-            </w:r>
-            <w:r>
-              <w:t>LESS</w:t>
-            </w:r>
-            <w:r>
-              <w:t>_THAN</w:t>
+              <w:t>5Km y LESS_THAN</w:t>
             </w:r>
           </w:p>
         </w:tc>
@@ -1811,17 +1880,13 @@
           </w:tcPr>
           <w:p>
             <w:r>
-              <w:t>Mensaje de Error: “</w:t>
+              <w:t xml:space="preserve">No se realiza ninguna </w:t>
             </w:r>
+            <w:proofErr w:type="spellStart"/>
             <w:r>
-              <w:t>Invalid distance</w:t>
+              <w:t>accion</w:t>
             </w:r>
-            <w:r>
-              <w:t>, not decimals or negatives allowed</w:t>
-            </w:r>
-            <w:r>
-              <w:t>”</w:t>
-            </w:r>
+            <w:proofErr w:type="spellEnd"/>
           </w:p>
         </w:tc>
       </w:tr>
@@ -1886,15 +1951,35 @@
             <w:r>
               <w:t>Mensaje de Error: “</w:t>
             </w:r>
+            <w:proofErr w:type="spellStart"/>
             <w:r>
-              <w:t xml:space="preserve">Location </w:t>
+              <w:t>Location</w:t>
             </w:r>
+            <w:proofErr w:type="spellEnd"/>
+            <w:r>
+              <w:t xml:space="preserve"> </w:t>
+            </w:r>
+            <w:proofErr w:type="spellStart"/>
             <w:r>
               <w:t>is</w:t>
             </w:r>
+            <w:proofErr w:type="spellEnd"/>
             <w:r>
-              <w:t xml:space="preserve"> not enable</w:t>
+              <w:t xml:space="preserve"> </w:t>
             </w:r>
+            <w:proofErr w:type="spellStart"/>
+            <w:r>
+              <w:t>not</w:t>
+            </w:r>
+            <w:proofErr w:type="spellEnd"/>
+            <w:r>
+              <w:t xml:space="preserve"> </w:t>
+            </w:r>
+            <w:proofErr w:type="spellStart"/>
+            <w:r>
+              <w:t>enable</w:t>
+            </w:r>
+            <w:proofErr w:type="spellEnd"/>
             <w:r>
               <w:t>”</w:t>
             </w:r>
@@ -1949,11 +2034,19 @@
                 <w:lang w:val="en-US"/>
               </w:rPr>
             </w:pPr>
+            <w:proofErr w:type="spellStart"/>
             <w:r>
               <w:rPr>
                 <w:lang w:val="en-US"/>
               </w:rPr>
-              <w:t>Mensaje de Error</w:t>
+              <w:t>Mensaje</w:t>
+            </w:r>
+            <w:proofErr w:type="spellEnd"/>
+            <w:r>
+              <w:rPr>
+                <w:lang w:val="en-US"/>
+              </w:rPr>
+              <w:t xml:space="preserve"> de Error</w:t>
             </w:r>
             <w:r>
               <w:rPr>
@@ -2221,7 +2314,15 @@
       </w:pBdr>
     </w:pPr>
     <w:r>
-      <w:t>Estructura de Datos y Algoritmos –  Práctica 3</w:t>
+      <w:t xml:space="preserve">Estructura de Datos y Algoritmos </w:t>
+    </w:r>
+    <w:proofErr w:type="gramStart"/>
+    <w:r>
+      <w:t>–  Práctica</w:t>
+    </w:r>
+    <w:proofErr w:type="gramEnd"/>
+    <w:r>
+      <w:t xml:space="preserve"> 3</w:t>
     </w:r>
   </w:p>
 </w:hdr>
@@ -2350,8 +2451,13 @@
           <w:pPr>
             <w:spacing w:after="0" w:line="240" w:lineRule="auto"/>
           </w:pPr>
+          <w:proofErr w:type="gramStart"/>
           <w:r>
-            <w:t>4º  Grado en Ing. Informática</w:t>
+            <w:t>4º  Grado</w:t>
+          </w:r>
+          <w:proofErr w:type="gramEnd"/>
+          <w:r>
+            <w:t xml:space="preserve"> en Ing. Informática</w:t>
           </w:r>
         </w:p>
         <w:p>

</xml_diff>

<commit_message>
Se terminado el informe del plan de pruebas
</commit_message>
<xml_diff>
--- a/Docs/Test Plans/US532227-FiltrarEstacionesPorDistancia-TestPlan.docx
+++ b/Docs/Test Plans/US532227-FiltrarEstacionesPorDistancia-TestPlan.docx
@@ -531,10 +531,10 @@
         <w:spacing w:after="0" w:line="240" w:lineRule="auto"/>
       </w:pPr>
       <w:r>
-        <w:t>Se verifica que la aplicación impide al técnico introducir la distancia</w:t>
-      </w:r>
-      <w:r>
-        <w:t xml:space="preserve"> y se le notifica</w:t>
+        <w:t xml:space="preserve">Se verifica que la </w:t>
+      </w:r>
+      <w:r>
+        <w:t>aplicación no realiza ningún tipo de acción</w:t>
       </w:r>
       <w:r>
         <w:t>.</w:t>
@@ -1238,19 +1238,10 @@
         <w:spacing w:after="0" w:line="240" w:lineRule="auto"/>
       </w:pPr>
       <w:r>
-        <w:t>El sistema muestra el mensaje “Distancia no v</w:t>
-      </w:r>
-      <w:r>
-        <w:t>á</w:t>
-      </w:r>
-      <w:r>
-        <w:t xml:space="preserve">lida” y no </w:t>
-      </w:r>
-      <w:r>
-        <w:t>realiza</w:t>
-      </w:r>
-      <w:r>
-        <w:t xml:space="preserve"> el filtrado</w:t>
+        <w:t>El sistema</w:t>
+      </w:r>
+      <w:r>
+        <w:t xml:space="preserve"> no realiza ninguna acción</w:t>
       </w:r>
       <w:r>
         <w:t>.</w:t>
@@ -1497,17 +1488,12 @@
         <w:t xml:space="preserve"> </w:t>
       </w:r>
       <w:proofErr w:type="spellStart"/>
-      <w:proofErr w:type="gramStart"/>
       <w:r>
         <w:t>onFilterClicked</w:t>
       </w:r>
       <w:proofErr w:type="spellEnd"/>
       <w:r>
-        <w:t>(</w:t>
-      </w:r>
-      <w:proofErr w:type="gramEnd"/>
-      <w:r>
-        <w:t xml:space="preserve">String </w:t>
+        <w:t xml:space="preserve">(String </w:t>
       </w:r>
       <w:proofErr w:type="spellStart"/>
       <w:r>
@@ -1548,23 +1534,17 @@
         <w:t xml:space="preserve"> ya que los otros métodos creados están en la vista y se tratan de </w:t>
       </w:r>
       <w:proofErr w:type="spellStart"/>
-      <w:proofErr w:type="gramStart"/>
       <w:r>
         <w:t>onClickFilterMoreThanDistance</w:t>
       </w:r>
       <w:proofErr w:type="spellEnd"/>
       <w:r>
-        <w:t>(</w:t>
-      </w:r>
-      <w:proofErr w:type="gramEnd"/>
-      <w:r>
-        <w:t>)</w:t>
+        <w:t>()</w:t>
       </w:r>
       <w:r>
         <w:t xml:space="preserve"> y </w:t>
       </w:r>
       <w:proofErr w:type="spellStart"/>
-      <w:proofErr w:type="gramStart"/>
       <w:r>
         <w:t>onClickFilter</w:t>
       </w:r>
@@ -1576,11 +1556,7 @@
       </w:r>
       <w:proofErr w:type="spellEnd"/>
       <w:r>
-        <w:t>(</w:t>
-      </w:r>
-      <w:proofErr w:type="gramEnd"/>
-      <w:r>
-        <w:t>)</w:t>
+        <w:t>()</w:t>
       </w:r>
       <w:r>
         <w:t xml:space="preserve"> cuya única función es llamar al </w:t>
@@ -1771,7 +1747,7 @@
           </w:tcPr>
           <w:p>
             <w:r>
-              <w:t>Lista Ordenada y filtrada:</w:t>
+              <w:t>Lista Ordenada y filtrada</w:t>
             </w:r>
           </w:p>
           <w:p/>
@@ -1833,7 +1809,7 @@
               <w:t>Lista</w:t>
             </w:r>
             <w:r>
-              <w:t xml:space="preserve"> Ordenada y filtrada:</w:t>
+              <w:t xml:space="preserve"> Ordenada y filtrada</w:t>
             </w:r>
           </w:p>
           <w:p/>
@@ -1873,6 +1849,22 @@
               <w:t>-10Km y MORE_THAN</w:t>
             </w:r>
           </w:p>
+          <w:p>
+            <w:r>
+              <w:t xml:space="preserve">Segunda </w:t>
+            </w:r>
+            <w:r>
+              <w:t>llamada con:</w:t>
+            </w:r>
+            <w:r>
+              <w:t xml:space="preserve"> </w:t>
+            </w:r>
+          </w:p>
+          <w:p>
+            <w:r>
+              <w:t>5.5Km y LESS_THAN</w:t>
+            </w:r>
+          </w:p>
         </w:tc>
         <w:tc>
           <w:tcPr>
@@ -1882,11 +1874,9 @@
             <w:r>
               <w:t xml:space="preserve">No se realiza ninguna </w:t>
             </w:r>
-            <w:proofErr w:type="spellStart"/>
             <w:r>
-              <w:t>accion</w:t>
+              <w:t>acción</w:t>
             </w:r>
-            <w:proofErr w:type="spellEnd"/>
           </w:p>
         </w:tc>
       </w:tr>
@@ -2124,6 +2114,36 @@
         <w:spacing w:after="120"/>
         <w:jc w:val="both"/>
       </w:pPr>
+      <w:r>
+        <w:t xml:space="preserve">Durante la ejecución de </w:t>
+      </w:r>
+      <w:r>
+        <w:t>las pruebas</w:t>
+      </w:r>
+      <w:r>
+        <w:t xml:space="preserve"> no se ha detectado ningún fallo en el funcionamiento de la </w:t>
+      </w:r>
+      <w:r>
+        <w:t>aplicación en lo que respecta a la funcionalidad descrita en la historia de usuario</w:t>
+      </w:r>
+      <w:r>
+        <w:t>. Para todos los casos la</w:t>
+      </w:r>
+      <w:r>
+        <w:t xml:space="preserve"> funcionalidad descrita se corresponde con el funcionamiento detectado por </w:t>
+      </w:r>
+      <w:r>
+        <w:t>las pruebas</w:t>
+      </w:r>
+      <w:r>
+        <w:t xml:space="preserve"> </w:t>
+      </w:r>
+      <w:r>
+        <w:t>y por tanto no ha sido necesario realizar ningún cambio en el código de la funcionalidad.</w:t>
+      </w:r>
+      <w:r>
+        <w:t xml:space="preserve"> </w:t>
+      </w:r>
     </w:p>
     <w:p>
       <w:pPr>
@@ -2314,15 +2334,7 @@
       </w:pBdr>
     </w:pPr>
     <w:r>
-      <w:t xml:space="preserve">Estructura de Datos y Algoritmos </w:t>
-    </w:r>
-    <w:proofErr w:type="gramStart"/>
-    <w:r>
-      <w:t>–  Práctica</w:t>
-    </w:r>
-    <w:proofErr w:type="gramEnd"/>
-    <w:r>
-      <w:t xml:space="preserve"> 3</w:t>
+      <w:t>Estructura de Datos y Algoritmos –  Práctica 3</w:t>
     </w:r>
   </w:p>
 </w:hdr>
@@ -2451,13 +2463,8 @@
           <w:pPr>
             <w:spacing w:after="0" w:line="240" w:lineRule="auto"/>
           </w:pPr>
-          <w:proofErr w:type="gramStart"/>
           <w:r>
-            <w:t>4º  Grado</w:t>
-          </w:r>
-          <w:proofErr w:type="gramEnd"/>
-          <w:r>
-            <w:t xml:space="preserve"> en Ing. Informática</w:t>
+            <w:t>4º  Grado en Ing. Informática</w:t>
           </w:r>
         </w:p>
         <w:p>
@@ -2466,6 +2473,14 @@
           </w:pPr>
           <w:r>
             <w:t>Universidad de Cantabria</w:t>
+          </w:r>
+        </w:p>
+        <w:p>
+          <w:pPr>
+            <w:spacing w:after="0" w:line="240" w:lineRule="auto"/>
+          </w:pPr>
+          <w:r>
+            <w:t>Neco Boo Ruiz</w:t>
           </w:r>
         </w:p>
       </w:tc>

</xml_diff>